<commit_message>
fix: dual ADF (daily+cumulative), cointegration analysis, economics explanation
</commit_message>
<xml_diff>
--- a/output/reports/strategy_report.docx
+++ b/output/reports/strategy_report.docx
@@ -140,21 +140,19 @@
         <w:pStyle w:val="3"/>
         <w:jc w:val="center"/>
         <w:rPr>
-          <w:color w:val="003366"/>
-          <w:sz w:val="60"/>
-          <w:szCs w:val="60"/>
+          <w:sz w:val="52"/>
+          <w:szCs w:val="52"/>
         </w:rPr>
       </w:pPr>
       <w:r>
         <w:rPr>
           <w:color w:val="003366"/>
-          <w:sz w:val="60"/>
-          <w:szCs w:val="60"/>
+          <w:sz w:val="52"/>
+          <w:szCs w:val="52"/>
         </w:rPr>
         <w:t>目 录</w:t>
       </w:r>
     </w:p>
-    <w:p/>
     <w:p>
       <w:pPr>
         <w:spacing w:before="80" w:after="80"/>
@@ -2494,6 +2492,12 @@
             <w:insideH w:val="single" w:color="auto" w:sz="4" w:space="0"/>
             <w:insideV w:val="single" w:color="auto" w:sz="4" w:space="0"/>
           </w:tblBorders>
+          <w:tblCellMar>
+            <w:top w:w="0" w:type="dxa"/>
+            <w:left w:w="108" w:type="dxa"/>
+            <w:bottom w:w="0" w:type="dxa"/>
+            <w:right w:w="108" w:type="dxa"/>
+          </w:tblCellMar>
         </w:tblPrEx>
         <w:trPr>
           <w:jc w:val="center"/>
@@ -4005,11 +4009,12 @@
         </w:tblCellMar>
       </w:tblPr>
       <w:tblGrid>
-        <w:gridCol w:w="1881"/>
-        <w:gridCol w:w="1881"/>
-        <w:gridCol w:w="1881"/>
-        <w:gridCol w:w="1881"/>
-        <w:gridCol w:w="1881"/>
+        <w:gridCol w:w="1568"/>
+        <w:gridCol w:w="1717"/>
+        <w:gridCol w:w="1568"/>
+        <w:gridCol w:w="1568"/>
+        <w:gridCol w:w="1568"/>
+        <w:gridCol w:w="1568"/>
       </w:tblGrid>
       <w:tr>
         <w:tblPrEx>
@@ -4033,7 +4038,7 @@
         </w:trPr>
         <w:tc>
           <w:tcPr>
-            <w:tcW w:w="1881" w:type="dxa"/>
+            <w:tcW w:w="1568" w:type="dxa"/>
             <w:shd w:val="clear" w:color="auto" w:fill="008B80"/>
           </w:tcPr>
           <w:p>
@@ -4054,7 +4059,7 @@
         </w:tc>
         <w:tc>
           <w:tcPr>
-            <w:tcW w:w="1881" w:type="dxa"/>
+            <w:tcW w:w="1568" w:type="dxa"/>
             <w:shd w:val="clear" w:color="auto" w:fill="008B80"/>
           </w:tcPr>
           <w:p>
@@ -4075,7 +4080,7 @@
         </w:tc>
         <w:tc>
           <w:tcPr>
-            <w:tcW w:w="1881" w:type="dxa"/>
+            <w:tcW w:w="1568" w:type="dxa"/>
             <w:shd w:val="clear" w:color="auto" w:fill="008B80"/>
           </w:tcPr>
           <w:p>
@@ -4096,7 +4101,7 @@
         </w:tc>
         <w:tc>
           <w:tcPr>
-            <w:tcW w:w="1881" w:type="dxa"/>
+            <w:tcW w:w="1568" w:type="dxa"/>
             <w:shd w:val="clear" w:color="auto" w:fill="008B80"/>
           </w:tcPr>
           <w:p>
@@ -4111,13 +4116,34 @@
                 <w:color w:val="FFFFFF"/>
                 <w:sz w:val="20"/>
               </w:rPr>
-              <w:t>ADF p</w:t>
-            </w:r>
-          </w:p>
-        </w:tc>
-        <w:tc>
-          <w:tcPr>
-            <w:tcW w:w="1881" w:type="dxa"/>
+              <w:t>ADF p(日频残差)</w:t>
+            </w:r>
+          </w:p>
+        </w:tc>
+        <w:tc>
+          <w:tcPr>
+            <w:tcW w:w="1568" w:type="dxa"/>
+            <w:shd w:val="clear" w:color="auto" w:fill="008B80"/>
+          </w:tcPr>
+          <w:p>
+            <w:pPr>
+              <w:spacing w:line="240" w:lineRule="auto"/>
+              <w:jc w:val="center"/>
+            </w:pPr>
+            <w:r>
+              <w:rPr>
+                <w:rFonts w:ascii="Arial" w:hAnsi="Arial" w:eastAsia="微软雅黑"/>
+                <w:b/>
+                <w:color w:val="FFFFFF"/>
+                <w:sz w:val="20"/>
+              </w:rPr>
+              <w:t>ADF p(累积残差)</w:t>
+            </w:r>
+          </w:p>
+        </w:tc>
+        <w:tc>
+          <w:tcPr>
+            <w:tcW w:w="1568" w:type="dxa"/>
             <w:shd w:val="clear" w:color="auto" w:fill="008B80"/>
           </w:tcPr>
           <w:p>
@@ -4159,7 +4185,7 @@
         </w:trPr>
         <w:tc>
           <w:tcPr>
-            <w:tcW w:w="1881" w:type="dxa"/>
+            <w:tcW w:w="1568" w:type="dxa"/>
             <w:shd w:val="clear" w:color="auto" w:fill="F0F4F8"/>
           </w:tcPr>
           <w:p>
@@ -4177,7 +4203,7 @@
         </w:tc>
         <w:tc>
           <w:tcPr>
-            <w:tcW w:w="1881" w:type="dxa"/>
+            <w:tcW w:w="1568" w:type="dxa"/>
             <w:shd w:val="clear" w:color="auto" w:fill="F0F4F8"/>
           </w:tcPr>
           <w:p>
@@ -4195,7 +4221,7 @@
         </w:tc>
         <w:tc>
           <w:tcPr>
-            <w:tcW w:w="1881" w:type="dxa"/>
+            <w:tcW w:w="1568" w:type="dxa"/>
             <w:shd w:val="clear" w:color="auto" w:fill="F0F4F8"/>
           </w:tcPr>
           <w:p>
@@ -4213,7 +4239,7 @@
         </w:tc>
         <w:tc>
           <w:tcPr>
-            <w:tcW w:w="1881" w:type="dxa"/>
+            <w:tcW w:w="1568" w:type="dxa"/>
             <w:shd w:val="clear" w:color="auto" w:fill="F0F4F8"/>
           </w:tcPr>
           <w:p>
@@ -4225,13 +4251,13 @@
                 <w:rFonts w:ascii="Arial" w:hAnsi="Arial" w:eastAsia="微软雅黑"/>
                 <w:sz w:val="20"/>
               </w:rPr>
-              <w:t>0.0000</w:t>
-            </w:r>
-          </w:p>
-        </w:tc>
-        <w:tc>
-          <w:tcPr>
-            <w:tcW w:w="1881" w:type="dxa"/>
+              <w:t>0.00e+00</w:t>
+            </w:r>
+          </w:p>
+        </w:tc>
+        <w:tc>
+          <w:tcPr>
+            <w:tcW w:w="1568" w:type="dxa"/>
             <w:shd w:val="clear" w:color="auto" w:fill="F0F4F8"/>
           </w:tcPr>
           <w:p>
@@ -4243,7 +4269,25 @@
                 <w:rFonts w:ascii="Arial" w:hAnsi="Arial" w:eastAsia="微软雅黑"/>
                 <w:sz w:val="20"/>
               </w:rPr>
-              <w:t>通过</w:t>
+              <w:t>0.6446</w:t>
+            </w:r>
+          </w:p>
+        </w:tc>
+        <w:tc>
+          <w:tcPr>
+            <w:tcW w:w="1568" w:type="dxa"/>
+            <w:shd w:val="clear" w:color="auto" w:fill="F0F4F8"/>
+          </w:tcPr>
+          <w:p>
+            <w:pPr>
+              <w:spacing w:line="240" w:lineRule="auto"/>
+            </w:pPr>
+            <w:r>
+              <w:rPr>
+                <w:rFonts w:ascii="Arial" w:hAnsi="Arial" w:eastAsia="微软雅黑"/>
+                <w:sz w:val="20"/>
+              </w:rPr>
+              <w:t>否</w:t>
             </w:r>
           </w:p>
         </w:tc>
@@ -4270,7 +4314,7 @@
         </w:trPr>
         <w:tc>
           <w:tcPr>
-            <w:tcW w:w="1881" w:type="dxa"/>
+            <w:tcW w:w="1568" w:type="dxa"/>
           </w:tcPr>
           <w:p>
             <w:pPr>
@@ -4287,7 +4331,7 @@
         </w:tc>
         <w:tc>
           <w:tcPr>
-            <w:tcW w:w="1881" w:type="dxa"/>
+            <w:tcW w:w="1568" w:type="dxa"/>
           </w:tcPr>
           <w:p>
             <w:pPr>
@@ -4304,7 +4348,7 @@
         </w:tc>
         <w:tc>
           <w:tcPr>
-            <w:tcW w:w="1881" w:type="dxa"/>
+            <w:tcW w:w="1568" w:type="dxa"/>
           </w:tcPr>
           <w:p>
             <w:pPr>
@@ -4321,35 +4365,52 @@
         </w:tc>
         <w:tc>
           <w:tcPr>
-            <w:tcW w:w="1881" w:type="dxa"/>
-          </w:tcPr>
-          <w:p>
-            <w:pPr>
-              <w:spacing w:line="240" w:lineRule="auto"/>
-            </w:pPr>
-            <w:r>
-              <w:rPr>
-                <w:rFonts w:ascii="Arial" w:hAnsi="Arial" w:eastAsia="微软雅黑"/>
-                <w:sz w:val="20"/>
-              </w:rPr>
-              <w:t>0.0000</w:t>
-            </w:r>
-          </w:p>
-        </w:tc>
-        <w:tc>
-          <w:tcPr>
-            <w:tcW w:w="1881" w:type="dxa"/>
-          </w:tcPr>
-          <w:p>
-            <w:pPr>
-              <w:spacing w:line="240" w:lineRule="auto"/>
-            </w:pPr>
-            <w:r>
-              <w:rPr>
-                <w:rFonts w:ascii="Arial" w:hAnsi="Arial" w:eastAsia="微软雅黑"/>
-                <w:sz w:val="20"/>
-              </w:rPr>
-              <w:t>通过</w:t>
+            <w:tcW w:w="1568" w:type="dxa"/>
+          </w:tcPr>
+          <w:p>
+            <w:pPr>
+              <w:spacing w:line="240" w:lineRule="auto"/>
+            </w:pPr>
+            <w:r>
+              <w:rPr>
+                <w:rFonts w:ascii="Arial" w:hAnsi="Arial" w:eastAsia="微软雅黑"/>
+                <w:sz w:val="20"/>
+              </w:rPr>
+              <w:t>0.00e+00</w:t>
+            </w:r>
+          </w:p>
+        </w:tc>
+        <w:tc>
+          <w:tcPr>
+            <w:tcW w:w="1568" w:type="dxa"/>
+          </w:tcPr>
+          <w:p>
+            <w:pPr>
+              <w:spacing w:line="240" w:lineRule="auto"/>
+            </w:pPr>
+            <w:r>
+              <w:rPr>
+                <w:rFonts w:ascii="Arial" w:hAnsi="Arial" w:eastAsia="微软雅黑"/>
+                <w:sz w:val="20"/>
+              </w:rPr>
+              <w:t>0.1791</w:t>
+            </w:r>
+          </w:p>
+        </w:tc>
+        <w:tc>
+          <w:tcPr>
+            <w:tcW w:w="1568" w:type="dxa"/>
+          </w:tcPr>
+          <w:p>
+            <w:pPr>
+              <w:spacing w:line="240" w:lineRule="auto"/>
+            </w:pPr>
+            <w:r>
+              <w:rPr>
+                <w:rFonts w:ascii="Arial" w:hAnsi="Arial" w:eastAsia="微软雅黑"/>
+                <w:sz w:val="20"/>
+              </w:rPr>
+              <w:t>否</w:t>
             </w:r>
           </w:p>
         </w:tc>
@@ -4376,7 +4437,7 @@
         </w:trPr>
         <w:tc>
           <w:tcPr>
-            <w:tcW w:w="1881" w:type="dxa"/>
+            <w:tcW w:w="1568" w:type="dxa"/>
             <w:shd w:val="clear" w:color="auto" w:fill="F0F4F8"/>
           </w:tcPr>
           <w:p>
@@ -4394,7 +4455,7 @@
         </w:tc>
         <w:tc>
           <w:tcPr>
-            <w:tcW w:w="1881" w:type="dxa"/>
+            <w:tcW w:w="1568" w:type="dxa"/>
             <w:shd w:val="clear" w:color="auto" w:fill="F0F4F8"/>
           </w:tcPr>
           <w:p>
@@ -4412,7 +4473,7 @@
         </w:tc>
         <w:tc>
           <w:tcPr>
-            <w:tcW w:w="1881" w:type="dxa"/>
+            <w:tcW w:w="1568" w:type="dxa"/>
             <w:shd w:val="clear" w:color="auto" w:fill="F0F4F8"/>
           </w:tcPr>
           <w:p>
@@ -4430,7 +4491,7 @@
         </w:tc>
         <w:tc>
           <w:tcPr>
-            <w:tcW w:w="1881" w:type="dxa"/>
+            <w:tcW w:w="1568" w:type="dxa"/>
             <w:shd w:val="clear" w:color="auto" w:fill="F0F4F8"/>
           </w:tcPr>
           <w:p>
@@ -4442,13 +4503,13 @@
                 <w:rFonts w:ascii="Arial" w:hAnsi="Arial" w:eastAsia="微软雅黑"/>
                 <w:sz w:val="20"/>
               </w:rPr>
-              <w:t>0.0000</w:t>
-            </w:r>
-          </w:p>
-        </w:tc>
-        <w:tc>
-          <w:tcPr>
-            <w:tcW w:w="1881" w:type="dxa"/>
+              <w:t>0.00e+00</w:t>
+            </w:r>
+          </w:p>
+        </w:tc>
+        <w:tc>
+          <w:tcPr>
+            <w:tcW w:w="1568" w:type="dxa"/>
             <w:shd w:val="clear" w:color="auto" w:fill="F0F4F8"/>
           </w:tcPr>
           <w:p>
@@ -4460,7 +4521,25 @@
                 <w:rFonts w:ascii="Arial" w:hAnsi="Arial" w:eastAsia="微软雅黑"/>
                 <w:sz w:val="20"/>
               </w:rPr>
-              <w:t>通过</w:t>
+              <w:t>0.6660</w:t>
+            </w:r>
+          </w:p>
+        </w:tc>
+        <w:tc>
+          <w:tcPr>
+            <w:tcW w:w="1568" w:type="dxa"/>
+            <w:shd w:val="clear" w:color="auto" w:fill="F0F4F8"/>
+          </w:tcPr>
+          <w:p>
+            <w:pPr>
+              <w:spacing w:line="240" w:lineRule="auto"/>
+            </w:pPr>
+            <w:r>
+              <w:rPr>
+                <w:rFonts w:ascii="Arial" w:hAnsi="Arial" w:eastAsia="微软雅黑"/>
+                <w:sz w:val="20"/>
+              </w:rPr>
+              <w:t>否</w:t>
             </w:r>
           </w:p>
         </w:tc>
@@ -4487,7 +4566,7 @@
         </w:trPr>
         <w:tc>
           <w:tcPr>
-            <w:tcW w:w="1881" w:type="dxa"/>
+            <w:tcW w:w="1568" w:type="dxa"/>
           </w:tcPr>
           <w:p>
             <w:pPr>
@@ -4504,7 +4583,7 @@
         </w:tc>
         <w:tc>
           <w:tcPr>
-            <w:tcW w:w="1881" w:type="dxa"/>
+            <w:tcW w:w="1568" w:type="dxa"/>
           </w:tcPr>
           <w:p>
             <w:pPr>
@@ -4521,7 +4600,7 @@
         </w:tc>
         <w:tc>
           <w:tcPr>
-            <w:tcW w:w="1881" w:type="dxa"/>
+            <w:tcW w:w="1568" w:type="dxa"/>
           </w:tcPr>
           <w:p>
             <w:pPr>
@@ -4538,24 +4617,41 @@
         </w:tc>
         <w:tc>
           <w:tcPr>
-            <w:tcW w:w="1881" w:type="dxa"/>
-          </w:tcPr>
-          <w:p>
-            <w:pPr>
-              <w:spacing w:line="240" w:lineRule="auto"/>
-            </w:pPr>
-            <w:r>
-              <w:rPr>
-                <w:rFonts w:ascii="Arial" w:hAnsi="Arial" w:eastAsia="微软雅黑"/>
-                <w:sz w:val="20"/>
-              </w:rPr>
-              <w:t>0.0000</w:t>
-            </w:r>
-          </w:p>
-        </w:tc>
-        <w:tc>
-          <w:tcPr>
-            <w:tcW w:w="1881" w:type="dxa"/>
+            <w:tcW w:w="1568" w:type="dxa"/>
+          </w:tcPr>
+          <w:p>
+            <w:pPr>
+              <w:spacing w:line="240" w:lineRule="auto"/>
+            </w:pPr>
+            <w:r>
+              <w:rPr>
+                <w:rFonts w:ascii="Arial" w:hAnsi="Arial" w:eastAsia="微软雅黑"/>
+                <w:sz w:val="20"/>
+              </w:rPr>
+              <w:t>3.55e-30</w:t>
+            </w:r>
+          </w:p>
+        </w:tc>
+        <w:tc>
+          <w:tcPr>
+            <w:tcW w:w="1568" w:type="dxa"/>
+          </w:tcPr>
+          <w:p>
+            <w:pPr>
+              <w:spacing w:line="240" w:lineRule="auto"/>
+            </w:pPr>
+            <w:r>
+              <w:rPr>
+                <w:rFonts w:ascii="Arial" w:hAnsi="Arial" w:eastAsia="微软雅黑"/>
+                <w:sz w:val="20"/>
+              </w:rPr>
+              <w:t>0.2025</w:t>
+            </w:r>
+          </w:p>
+        </w:tc>
+        <w:tc>
+          <w:tcPr>
+            <w:tcW w:w="1568" w:type="dxa"/>
           </w:tcPr>
           <w:p>
             <w:pPr>
@@ -4593,7 +4689,7 @@
         </w:trPr>
         <w:tc>
           <w:tcPr>
-            <w:tcW w:w="1881" w:type="dxa"/>
+            <w:tcW w:w="1568" w:type="dxa"/>
             <w:shd w:val="clear" w:color="auto" w:fill="F0F4F8"/>
           </w:tcPr>
           <w:p>
@@ -4611,7 +4707,7 @@
         </w:tc>
         <w:tc>
           <w:tcPr>
-            <w:tcW w:w="1881" w:type="dxa"/>
+            <w:tcW w:w="1568" w:type="dxa"/>
             <w:shd w:val="clear" w:color="auto" w:fill="F0F4F8"/>
           </w:tcPr>
           <w:p>
@@ -4629,7 +4725,7 @@
         </w:tc>
         <w:tc>
           <w:tcPr>
-            <w:tcW w:w="1881" w:type="dxa"/>
+            <w:tcW w:w="1568" w:type="dxa"/>
             <w:shd w:val="clear" w:color="auto" w:fill="F0F4F8"/>
           </w:tcPr>
           <w:p>
@@ -4647,7 +4743,7 @@
         </w:tc>
         <w:tc>
           <w:tcPr>
-            <w:tcW w:w="1881" w:type="dxa"/>
+            <w:tcW w:w="1568" w:type="dxa"/>
             <w:shd w:val="clear" w:color="auto" w:fill="F0F4F8"/>
           </w:tcPr>
           <w:p>
@@ -4659,13 +4755,13 @@
                 <w:rFonts w:ascii="Arial" w:hAnsi="Arial" w:eastAsia="微软雅黑"/>
                 <w:sz w:val="20"/>
               </w:rPr>
-              <w:t>0.0000</w:t>
-            </w:r>
-          </w:p>
-        </w:tc>
-        <w:tc>
-          <w:tcPr>
-            <w:tcW w:w="1881" w:type="dxa"/>
+              <w:t>0.00e+00</w:t>
+            </w:r>
+          </w:p>
+        </w:tc>
+        <w:tc>
+          <w:tcPr>
+            <w:tcW w:w="1568" w:type="dxa"/>
             <w:shd w:val="clear" w:color="auto" w:fill="F0F4F8"/>
           </w:tcPr>
           <w:p>
@@ -4677,7 +4773,25 @@
                 <w:rFonts w:ascii="Arial" w:hAnsi="Arial" w:eastAsia="微软雅黑"/>
                 <w:sz w:val="20"/>
               </w:rPr>
-              <w:t>通过</w:t>
+              <w:t>0.4410</w:t>
+            </w:r>
+          </w:p>
+        </w:tc>
+        <w:tc>
+          <w:tcPr>
+            <w:tcW w:w="1568" w:type="dxa"/>
+            <w:shd w:val="clear" w:color="auto" w:fill="F0F4F8"/>
+          </w:tcPr>
+          <w:p>
+            <w:pPr>
+              <w:spacing w:line="240" w:lineRule="auto"/>
+            </w:pPr>
+            <w:r>
+              <w:rPr>
+                <w:rFonts w:ascii="Arial" w:hAnsi="Arial" w:eastAsia="微软雅黑"/>
+                <w:sz w:val="20"/>
+              </w:rPr>
+              <w:t>否</w:t>
             </w:r>
           </w:p>
         </w:tc>
@@ -4704,7 +4818,7 @@
         </w:trPr>
         <w:tc>
           <w:tcPr>
-            <w:tcW w:w="1881" w:type="dxa"/>
+            <w:tcW w:w="1568" w:type="dxa"/>
           </w:tcPr>
           <w:p>
             <w:pPr>
@@ -4721,7 +4835,7 @@
         </w:tc>
         <w:tc>
           <w:tcPr>
-            <w:tcW w:w="1881" w:type="dxa"/>
+            <w:tcW w:w="1568" w:type="dxa"/>
           </w:tcPr>
           <w:p>
             <w:pPr>
@@ -4738,7 +4852,7 @@
         </w:tc>
         <w:tc>
           <w:tcPr>
-            <w:tcW w:w="1881" w:type="dxa"/>
+            <w:tcW w:w="1568" w:type="dxa"/>
           </w:tcPr>
           <w:p>
             <w:pPr>
@@ -4755,24 +4869,41 @@
         </w:tc>
         <w:tc>
           <w:tcPr>
-            <w:tcW w:w="1881" w:type="dxa"/>
-          </w:tcPr>
-          <w:p>
-            <w:pPr>
-              <w:spacing w:line="240" w:lineRule="auto"/>
-            </w:pPr>
-            <w:r>
-              <w:rPr>
-                <w:rFonts w:ascii="Arial" w:hAnsi="Arial" w:eastAsia="微软雅黑"/>
-                <w:sz w:val="20"/>
-              </w:rPr>
-              <w:t>0.0000</w:t>
-            </w:r>
-          </w:p>
-        </w:tc>
-        <w:tc>
-          <w:tcPr>
-            <w:tcW w:w="1881" w:type="dxa"/>
+            <w:tcW w:w="1568" w:type="dxa"/>
+          </w:tcPr>
+          <w:p>
+            <w:pPr>
+              <w:spacing w:line="240" w:lineRule="auto"/>
+            </w:pPr>
+            <w:r>
+              <w:rPr>
+                <w:rFonts w:ascii="Arial" w:hAnsi="Arial" w:eastAsia="微软雅黑"/>
+                <w:sz w:val="20"/>
+              </w:rPr>
+              <w:t>1.05e-29</w:t>
+            </w:r>
+          </w:p>
+        </w:tc>
+        <w:tc>
+          <w:tcPr>
+            <w:tcW w:w="1568" w:type="dxa"/>
+          </w:tcPr>
+          <w:p>
+            <w:pPr>
+              <w:spacing w:line="240" w:lineRule="auto"/>
+            </w:pPr>
+            <w:r>
+              <w:rPr>
+                <w:rFonts w:ascii="Arial" w:hAnsi="Arial" w:eastAsia="微软雅黑"/>
+                <w:sz w:val="20"/>
+              </w:rPr>
+              <w:t>0.1491</w:t>
+            </w:r>
+          </w:p>
+        </w:tc>
+        <w:tc>
+          <w:tcPr>
+            <w:tcW w:w="1568" w:type="dxa"/>
           </w:tcPr>
           <w:p>
             <w:pPr>
@@ -4810,7 +4941,7 @@
         </w:trPr>
         <w:tc>
           <w:tcPr>
-            <w:tcW w:w="1881" w:type="dxa"/>
+            <w:tcW w:w="1568" w:type="dxa"/>
             <w:shd w:val="clear" w:color="auto" w:fill="F0F4F8"/>
           </w:tcPr>
           <w:p>
@@ -4828,7 +4959,7 @@
         </w:tc>
         <w:tc>
           <w:tcPr>
-            <w:tcW w:w="1881" w:type="dxa"/>
+            <w:tcW w:w="1568" w:type="dxa"/>
             <w:shd w:val="clear" w:color="auto" w:fill="F0F4F8"/>
           </w:tcPr>
           <w:p>
@@ -4846,7 +4977,7 @@
         </w:tc>
         <w:tc>
           <w:tcPr>
-            <w:tcW w:w="1881" w:type="dxa"/>
+            <w:tcW w:w="1568" w:type="dxa"/>
             <w:shd w:val="clear" w:color="auto" w:fill="F0F4F8"/>
           </w:tcPr>
           <w:p>
@@ -4864,7 +4995,7 @@
         </w:tc>
         <w:tc>
           <w:tcPr>
-            <w:tcW w:w="1881" w:type="dxa"/>
+            <w:tcW w:w="1568" w:type="dxa"/>
             <w:shd w:val="clear" w:color="auto" w:fill="F0F4F8"/>
           </w:tcPr>
           <w:p>
@@ -4876,13 +5007,31 @@
                 <w:rFonts w:ascii="Arial" w:hAnsi="Arial" w:eastAsia="微软雅黑"/>
                 <w:sz w:val="20"/>
               </w:rPr>
-              <w:t>0.0000</w:t>
-            </w:r>
-          </w:p>
-        </w:tc>
-        <w:tc>
-          <w:tcPr>
-            <w:tcW w:w="1881" w:type="dxa"/>
+              <w:t>0.00e+00</w:t>
+            </w:r>
+          </w:p>
+        </w:tc>
+        <w:tc>
+          <w:tcPr>
+            <w:tcW w:w="1568" w:type="dxa"/>
+            <w:shd w:val="clear" w:color="auto" w:fill="F0F4F8"/>
+          </w:tcPr>
+          <w:p>
+            <w:pPr>
+              <w:spacing w:line="240" w:lineRule="auto"/>
+            </w:pPr>
+            <w:r>
+              <w:rPr>
+                <w:rFonts w:ascii="Arial" w:hAnsi="Arial" w:eastAsia="微软雅黑"/>
+                <w:sz w:val="20"/>
+              </w:rPr>
+              <w:t>0.2436</w:t>
+            </w:r>
+          </w:p>
+        </w:tc>
+        <w:tc>
+          <w:tcPr>
+            <w:tcW w:w="1568" w:type="dxa"/>
             <w:shd w:val="clear" w:color="auto" w:fill="F0F4F8"/>
           </w:tcPr>
           <w:p>
@@ -4921,7 +5070,7 @@
         </w:trPr>
         <w:tc>
           <w:tcPr>
-            <w:tcW w:w="1881" w:type="dxa"/>
+            <w:tcW w:w="1568" w:type="dxa"/>
           </w:tcPr>
           <w:p>
             <w:pPr>
@@ -4938,7 +5087,7 @@
         </w:tc>
         <w:tc>
           <w:tcPr>
-            <w:tcW w:w="1881" w:type="dxa"/>
+            <w:tcW w:w="1568" w:type="dxa"/>
           </w:tcPr>
           <w:p>
             <w:pPr>
@@ -4955,7 +5104,7 @@
         </w:tc>
         <w:tc>
           <w:tcPr>
-            <w:tcW w:w="1881" w:type="dxa"/>
+            <w:tcW w:w="1568" w:type="dxa"/>
           </w:tcPr>
           <w:p>
             <w:pPr>
@@ -4972,24 +5121,41 @@
         </w:tc>
         <w:tc>
           <w:tcPr>
-            <w:tcW w:w="1881" w:type="dxa"/>
-          </w:tcPr>
-          <w:p>
-            <w:pPr>
-              <w:spacing w:line="240" w:lineRule="auto"/>
-            </w:pPr>
-            <w:r>
-              <w:rPr>
-                <w:rFonts w:ascii="Arial" w:hAnsi="Arial" w:eastAsia="微软雅黑"/>
-                <w:sz w:val="20"/>
-              </w:rPr>
-              <w:t>0.0000</w:t>
-            </w:r>
-          </w:p>
-        </w:tc>
-        <w:tc>
-          <w:tcPr>
-            <w:tcW w:w="1881" w:type="dxa"/>
+            <w:tcW w:w="1568" w:type="dxa"/>
+          </w:tcPr>
+          <w:p>
+            <w:pPr>
+              <w:spacing w:line="240" w:lineRule="auto"/>
+            </w:pPr>
+            <w:r>
+              <w:rPr>
+                <w:rFonts w:ascii="Arial" w:hAnsi="Arial" w:eastAsia="微软雅黑"/>
+                <w:sz w:val="20"/>
+              </w:rPr>
+              <w:t>0.00e+00</w:t>
+            </w:r>
+          </w:p>
+        </w:tc>
+        <w:tc>
+          <w:tcPr>
+            <w:tcW w:w="1568" w:type="dxa"/>
+          </w:tcPr>
+          <w:p>
+            <w:pPr>
+              <w:spacing w:line="240" w:lineRule="auto"/>
+            </w:pPr>
+            <w:r>
+              <w:rPr>
+                <w:rFonts w:ascii="Arial" w:hAnsi="Arial" w:eastAsia="微软雅黑"/>
+                <w:sz w:val="20"/>
+              </w:rPr>
+              <w:t>0.5021</w:t>
+            </w:r>
+          </w:p>
+        </w:tc>
+        <w:tc>
+          <w:tcPr>
+            <w:tcW w:w="1568" w:type="dxa"/>
           </w:tcPr>
           <w:p>
             <w:pPr>
@@ -5027,7 +5193,7 @@
         </w:trPr>
         <w:tc>
           <w:tcPr>
-            <w:tcW w:w="1881" w:type="dxa"/>
+            <w:tcW w:w="1568" w:type="dxa"/>
             <w:shd w:val="clear" w:color="auto" w:fill="F0F4F8"/>
           </w:tcPr>
           <w:p>
@@ -5045,7 +5211,7 @@
         </w:tc>
         <w:tc>
           <w:tcPr>
-            <w:tcW w:w="1881" w:type="dxa"/>
+            <w:tcW w:w="1568" w:type="dxa"/>
             <w:shd w:val="clear" w:color="auto" w:fill="F0F4F8"/>
           </w:tcPr>
           <w:p>
@@ -5063,7 +5229,7 @@
         </w:tc>
         <w:tc>
           <w:tcPr>
-            <w:tcW w:w="1881" w:type="dxa"/>
+            <w:tcW w:w="1568" w:type="dxa"/>
             <w:shd w:val="clear" w:color="auto" w:fill="F0F4F8"/>
           </w:tcPr>
           <w:p>
@@ -5081,7 +5247,7 @@
         </w:tc>
         <w:tc>
           <w:tcPr>
-            <w:tcW w:w="1881" w:type="dxa"/>
+            <w:tcW w:w="1568" w:type="dxa"/>
             <w:shd w:val="clear" w:color="auto" w:fill="F0F4F8"/>
           </w:tcPr>
           <w:p>
@@ -5093,13 +5259,13 @@
                 <w:rFonts w:ascii="Arial" w:hAnsi="Arial" w:eastAsia="微软雅黑"/>
                 <w:sz w:val="20"/>
               </w:rPr>
-              <w:t>0.0000</w:t>
-            </w:r>
-          </w:p>
-        </w:tc>
-        <w:tc>
-          <w:tcPr>
-            <w:tcW w:w="1881" w:type="dxa"/>
+              <w:t>0.00e+00</w:t>
+            </w:r>
+          </w:p>
+        </w:tc>
+        <w:tc>
+          <w:tcPr>
+            <w:tcW w:w="1568" w:type="dxa"/>
             <w:shd w:val="clear" w:color="auto" w:fill="F0F4F8"/>
           </w:tcPr>
           <w:p>
@@ -5111,7 +5277,25 @@
                 <w:rFonts w:ascii="Arial" w:hAnsi="Arial" w:eastAsia="微软雅黑"/>
                 <w:sz w:val="20"/>
               </w:rPr>
-              <w:t>通过</w:t>
+              <w:t>0.5900</w:t>
+            </w:r>
+          </w:p>
+        </w:tc>
+        <w:tc>
+          <w:tcPr>
+            <w:tcW w:w="1568" w:type="dxa"/>
+            <w:shd w:val="clear" w:color="auto" w:fill="F0F4F8"/>
+          </w:tcPr>
+          <w:p>
+            <w:pPr>
+              <w:spacing w:line="240" w:lineRule="auto"/>
+            </w:pPr>
+            <w:r>
+              <w:rPr>
+                <w:rFonts w:ascii="Arial" w:hAnsi="Arial" w:eastAsia="微软雅黑"/>
+                <w:sz w:val="20"/>
+              </w:rPr>
+              <w:t>否</w:t>
             </w:r>
           </w:p>
         </w:tc>
@@ -5138,7 +5322,7 @@
         </w:trPr>
         <w:tc>
           <w:tcPr>
-            <w:tcW w:w="1881" w:type="dxa"/>
+            <w:tcW w:w="1568" w:type="dxa"/>
           </w:tcPr>
           <w:p>
             <w:pPr>
@@ -5155,7 +5339,7 @@
         </w:tc>
         <w:tc>
           <w:tcPr>
-            <w:tcW w:w="1881" w:type="dxa"/>
+            <w:tcW w:w="1568" w:type="dxa"/>
           </w:tcPr>
           <w:p>
             <w:pPr>
@@ -5172,7 +5356,7 @@
         </w:tc>
         <w:tc>
           <w:tcPr>
-            <w:tcW w:w="1881" w:type="dxa"/>
+            <w:tcW w:w="1568" w:type="dxa"/>
           </w:tcPr>
           <w:p>
             <w:pPr>
@@ -5189,35 +5373,52 @@
         </w:tc>
         <w:tc>
           <w:tcPr>
-            <w:tcW w:w="1881" w:type="dxa"/>
-          </w:tcPr>
-          <w:p>
-            <w:pPr>
-              <w:spacing w:line="240" w:lineRule="auto"/>
-            </w:pPr>
-            <w:r>
-              <w:rPr>
-                <w:rFonts w:ascii="Arial" w:hAnsi="Arial" w:eastAsia="微软雅黑"/>
-                <w:sz w:val="20"/>
-              </w:rPr>
-              <w:t>0.0000</w:t>
-            </w:r>
-          </w:p>
-        </w:tc>
-        <w:tc>
-          <w:tcPr>
-            <w:tcW w:w="1881" w:type="dxa"/>
-          </w:tcPr>
-          <w:p>
-            <w:pPr>
-              <w:spacing w:line="240" w:lineRule="auto"/>
-            </w:pPr>
-            <w:r>
-              <w:rPr>
-                <w:rFonts w:ascii="Arial" w:hAnsi="Arial" w:eastAsia="微软雅黑"/>
-                <w:sz w:val="20"/>
-              </w:rPr>
-              <w:t>通过</w:t>
+            <w:tcW w:w="1568" w:type="dxa"/>
+          </w:tcPr>
+          <w:p>
+            <w:pPr>
+              <w:spacing w:line="240" w:lineRule="auto"/>
+            </w:pPr>
+            <w:r>
+              <w:rPr>
+                <w:rFonts w:ascii="Arial" w:hAnsi="Arial" w:eastAsia="微软雅黑"/>
+                <w:sz w:val="20"/>
+              </w:rPr>
+              <w:t>0.00e+00</w:t>
+            </w:r>
+          </w:p>
+        </w:tc>
+        <w:tc>
+          <w:tcPr>
+            <w:tcW w:w="1568" w:type="dxa"/>
+          </w:tcPr>
+          <w:p>
+            <w:pPr>
+              <w:spacing w:line="240" w:lineRule="auto"/>
+            </w:pPr>
+            <w:r>
+              <w:rPr>
+                <w:rFonts w:ascii="Arial" w:hAnsi="Arial" w:eastAsia="微软雅黑"/>
+                <w:sz w:val="20"/>
+              </w:rPr>
+              <w:t>0.1548</w:t>
+            </w:r>
+          </w:p>
+        </w:tc>
+        <w:tc>
+          <w:tcPr>
+            <w:tcW w:w="1568" w:type="dxa"/>
+          </w:tcPr>
+          <w:p>
+            <w:pPr>
+              <w:spacing w:line="240" w:lineRule="auto"/>
+            </w:pPr>
+            <w:r>
+              <w:rPr>
+                <w:rFonts w:ascii="Arial" w:hAnsi="Arial" w:eastAsia="微软雅黑"/>
+                <w:sz w:val="20"/>
+              </w:rPr>
+              <w:t>否</w:t>
             </w:r>
           </w:p>
         </w:tc>
@@ -5244,7 +5445,7 @@
         </w:trPr>
         <w:tc>
           <w:tcPr>
-            <w:tcW w:w="1881" w:type="dxa"/>
+            <w:tcW w:w="1568" w:type="dxa"/>
             <w:shd w:val="clear" w:color="auto" w:fill="F0F4F8"/>
           </w:tcPr>
           <w:p>
@@ -5262,7 +5463,7 @@
         </w:tc>
         <w:tc>
           <w:tcPr>
-            <w:tcW w:w="1881" w:type="dxa"/>
+            <w:tcW w:w="1568" w:type="dxa"/>
             <w:shd w:val="clear" w:color="auto" w:fill="F0F4F8"/>
           </w:tcPr>
           <w:p>
@@ -5280,7 +5481,7 @@
         </w:tc>
         <w:tc>
           <w:tcPr>
-            <w:tcW w:w="1881" w:type="dxa"/>
+            <w:tcW w:w="1568" w:type="dxa"/>
             <w:shd w:val="clear" w:color="auto" w:fill="F0F4F8"/>
           </w:tcPr>
           <w:p>
@@ -5298,7 +5499,7 @@
         </w:tc>
         <w:tc>
           <w:tcPr>
-            <w:tcW w:w="1881" w:type="dxa"/>
+            <w:tcW w:w="1568" w:type="dxa"/>
             <w:shd w:val="clear" w:color="auto" w:fill="F0F4F8"/>
           </w:tcPr>
           <w:p>
@@ -5310,13 +5511,13 @@
                 <w:rFonts w:ascii="Arial" w:hAnsi="Arial" w:eastAsia="微软雅黑"/>
                 <w:sz w:val="20"/>
               </w:rPr>
-              <w:t>0.0000</w:t>
-            </w:r>
-          </w:p>
-        </w:tc>
-        <w:tc>
-          <w:tcPr>
-            <w:tcW w:w="1881" w:type="dxa"/>
+              <w:t>0.00e+00</w:t>
+            </w:r>
+          </w:p>
+        </w:tc>
+        <w:tc>
+          <w:tcPr>
+            <w:tcW w:w="1568" w:type="dxa"/>
             <w:shd w:val="clear" w:color="auto" w:fill="F0F4F8"/>
           </w:tcPr>
           <w:p>
@@ -5328,7 +5529,25 @@
                 <w:rFonts w:ascii="Arial" w:hAnsi="Arial" w:eastAsia="微软雅黑"/>
                 <w:sz w:val="20"/>
               </w:rPr>
-              <w:t>通过</w:t>
+              <w:t>0.4320</w:t>
+            </w:r>
+          </w:p>
+        </w:tc>
+        <w:tc>
+          <w:tcPr>
+            <w:tcW w:w="1568" w:type="dxa"/>
+            <w:shd w:val="clear" w:color="auto" w:fill="F0F4F8"/>
+          </w:tcPr>
+          <w:p>
+            <w:pPr>
+              <w:spacing w:line="240" w:lineRule="auto"/>
+            </w:pPr>
+            <w:r>
+              <w:rPr>
+                <w:rFonts w:ascii="Arial" w:hAnsi="Arial" w:eastAsia="微软雅黑"/>
+                <w:sz w:val="20"/>
+              </w:rPr>
+              <w:t>否</w:t>
             </w:r>
           </w:p>
         </w:tc>
@@ -5355,7 +5574,7 @@
         </w:trPr>
         <w:tc>
           <w:tcPr>
-            <w:tcW w:w="1881" w:type="dxa"/>
+            <w:tcW w:w="1568" w:type="dxa"/>
           </w:tcPr>
           <w:p>
             <w:pPr>
@@ -5372,7 +5591,7 @@
         </w:tc>
         <w:tc>
           <w:tcPr>
-            <w:tcW w:w="1881" w:type="dxa"/>
+            <w:tcW w:w="1568" w:type="dxa"/>
           </w:tcPr>
           <w:p>
             <w:pPr>
@@ -5389,7 +5608,7 @@
         </w:tc>
         <w:tc>
           <w:tcPr>
-            <w:tcW w:w="1881" w:type="dxa"/>
+            <w:tcW w:w="1568" w:type="dxa"/>
           </w:tcPr>
           <w:p>
             <w:pPr>
@@ -5406,24 +5625,41 @@
         </w:tc>
         <w:tc>
           <w:tcPr>
-            <w:tcW w:w="1881" w:type="dxa"/>
-          </w:tcPr>
-          <w:p>
-            <w:pPr>
-              <w:spacing w:line="240" w:lineRule="auto"/>
-            </w:pPr>
-            <w:r>
-              <w:rPr>
-                <w:rFonts w:ascii="Arial" w:hAnsi="Arial" w:eastAsia="微软雅黑"/>
-                <w:sz w:val="20"/>
-              </w:rPr>
-              <w:t>0.0000</w:t>
-            </w:r>
-          </w:p>
-        </w:tc>
-        <w:tc>
-          <w:tcPr>
-            <w:tcW w:w="1881" w:type="dxa"/>
+            <w:tcW w:w="1568" w:type="dxa"/>
+          </w:tcPr>
+          <w:p>
+            <w:pPr>
+              <w:spacing w:line="240" w:lineRule="auto"/>
+            </w:pPr>
+            <w:r>
+              <w:rPr>
+                <w:rFonts w:ascii="Arial" w:hAnsi="Arial" w:eastAsia="微软雅黑"/>
+                <w:sz w:val="20"/>
+              </w:rPr>
+              <w:t>0.00e+00</w:t>
+            </w:r>
+          </w:p>
+        </w:tc>
+        <w:tc>
+          <w:tcPr>
+            <w:tcW w:w="1568" w:type="dxa"/>
+          </w:tcPr>
+          <w:p>
+            <w:pPr>
+              <w:spacing w:line="240" w:lineRule="auto"/>
+            </w:pPr>
+            <w:r>
+              <w:rPr>
+                <w:rFonts w:ascii="Arial" w:hAnsi="Arial" w:eastAsia="微软雅黑"/>
+                <w:sz w:val="20"/>
+              </w:rPr>
+              <w:t>0.0167</w:t>
+            </w:r>
+          </w:p>
+        </w:tc>
+        <w:tc>
+          <w:tcPr>
+            <w:tcW w:w="1568" w:type="dxa"/>
           </w:tcPr>
           <w:p>
             <w:pPr>
@@ -5435,6 +5671,129 @@
                 <w:sz w:val="20"/>
               </w:rPr>
               <w:t>通过</w:t>
+            </w:r>
+          </w:p>
+        </w:tc>
+      </w:tr>
+      <w:tr>
+        <w:tblPrEx>
+          <w:tblBorders>
+            <w:top w:val="single" w:color="auto" w:sz="4" w:space="0"/>
+            <w:left w:val="single" w:color="auto" w:sz="4" w:space="0"/>
+            <w:bottom w:val="single" w:color="auto" w:sz="4" w:space="0"/>
+            <w:right w:val="single" w:color="auto" w:sz="4" w:space="0"/>
+            <w:insideH w:val="single" w:color="auto" w:sz="4" w:space="0"/>
+            <w:insideV w:val="single" w:color="auto" w:sz="4" w:space="0"/>
+          </w:tblBorders>
+        </w:tblPrEx>
+        <w:trPr>
+          <w:jc w:val="center"/>
+        </w:trPr>
+        <w:tc>
+          <w:tcPr>
+            <w:tcW w:w="1568" w:type="dxa"/>
+            <w:shd w:val="clear" w:color="auto" w:fill="F0F4F8"/>
+          </w:tcPr>
+          <w:p>
+            <w:pPr>
+              <w:spacing w:line="240" w:lineRule="auto"/>
+            </w:pPr>
+            <w:r>
+              <w:rPr>
+                <w:rFonts w:ascii="Arial" w:hAnsi="Arial" w:eastAsia="微软雅黑"/>
+                <w:sz w:val="20"/>
+              </w:rPr>
+              <w:t>OP</w:t>
+            </w:r>
+          </w:p>
+        </w:tc>
+        <w:tc>
+          <w:tcPr>
+            <w:tcW w:w="1568" w:type="dxa"/>
+            <w:shd w:val="clear" w:color="auto" w:fill="F0F4F8"/>
+          </w:tcPr>
+          <w:p>
+            <w:pPr>
+              <w:spacing w:line="240" w:lineRule="auto"/>
+            </w:pPr>
+            <w:r>
+              <w:rPr>
+                <w:rFonts w:ascii="Arial" w:hAnsi="Arial" w:eastAsia="微软雅黑"/>
+                <w:sz w:val="20"/>
+              </w:rPr>
+              <w:t>ETH+BTC</w:t>
+            </w:r>
+          </w:p>
+        </w:tc>
+        <w:tc>
+          <w:tcPr>
+            <w:tcW w:w="1568" w:type="dxa"/>
+            <w:shd w:val="clear" w:color="auto" w:fill="F0F4F8"/>
+          </w:tcPr>
+          <w:p>
+            <w:pPr>
+              <w:spacing w:line="240" w:lineRule="auto"/>
+            </w:pPr>
+            <w:r>
+              <w:rPr>
+                <w:rFonts w:ascii="Arial" w:hAnsi="Arial" w:eastAsia="微软雅黑"/>
+                <w:sz w:val="20"/>
+              </w:rPr>
+              <w:t>0.537</w:t>
+            </w:r>
+          </w:p>
+        </w:tc>
+        <w:tc>
+          <w:tcPr>
+            <w:tcW w:w="1568" w:type="dxa"/>
+            <w:shd w:val="clear" w:color="auto" w:fill="F0F4F8"/>
+          </w:tcPr>
+          <w:p>
+            <w:pPr>
+              <w:spacing w:line="240" w:lineRule="auto"/>
+            </w:pPr>
+            <w:r>
+              <w:rPr>
+                <w:rFonts w:ascii="Arial" w:hAnsi="Arial" w:eastAsia="微软雅黑"/>
+                <w:sz w:val="20"/>
+              </w:rPr>
+              <w:t>0.00e+00</w:t>
+            </w:r>
+          </w:p>
+        </w:tc>
+        <w:tc>
+          <w:tcPr>
+            <w:tcW w:w="1568" w:type="dxa"/>
+            <w:shd w:val="clear" w:color="auto" w:fill="F0F4F8"/>
+          </w:tcPr>
+          <w:p>
+            <w:pPr>
+              <w:spacing w:line="240" w:lineRule="auto"/>
+            </w:pPr>
+            <w:r>
+              <w:rPr>
+                <w:rFonts w:ascii="Arial" w:hAnsi="Arial" w:eastAsia="微软雅黑"/>
+                <w:sz w:val="20"/>
+              </w:rPr>
+              <w:t>0.5027</w:t>
+            </w:r>
+          </w:p>
+        </w:tc>
+        <w:tc>
+          <w:tcPr>
+            <w:tcW w:w="1568" w:type="dxa"/>
+            <w:shd w:val="clear" w:color="auto" w:fill="F0F4F8"/>
+          </w:tcPr>
+          <w:p>
+            <w:pPr>
+              <w:spacing w:line="240" w:lineRule="auto"/>
+            </w:pPr>
+            <w:r>
+              <w:rPr>
+                <w:rFonts w:ascii="Arial" w:hAnsi="Arial" w:eastAsia="微软雅黑"/>
+                <w:sz w:val="20"/>
+              </w:rPr>
+              <w:t>否</w:t>
             </w:r>
           </w:p>
         </w:tc>
@@ -5461,80 +5820,92 @@
         </w:trPr>
         <w:tc>
           <w:tcPr>
-            <w:tcW w:w="1881" w:type="dxa"/>
-            <w:shd w:val="clear" w:color="auto" w:fill="F0F4F8"/>
-          </w:tcPr>
-          <w:p>
-            <w:pPr>
-              <w:spacing w:line="240" w:lineRule="auto"/>
-            </w:pPr>
-            <w:r>
-              <w:rPr>
-                <w:rFonts w:ascii="Arial" w:hAnsi="Arial" w:eastAsia="微软雅黑"/>
-                <w:sz w:val="20"/>
-              </w:rPr>
-              <w:t>OP</w:t>
-            </w:r>
-          </w:p>
-        </w:tc>
-        <w:tc>
-          <w:tcPr>
-            <w:tcW w:w="1881" w:type="dxa"/>
-            <w:shd w:val="clear" w:color="auto" w:fill="F0F4F8"/>
-          </w:tcPr>
-          <w:p>
-            <w:pPr>
-              <w:spacing w:line="240" w:lineRule="auto"/>
-            </w:pPr>
-            <w:r>
-              <w:rPr>
-                <w:rFonts w:ascii="Arial" w:hAnsi="Arial" w:eastAsia="微软雅黑"/>
-                <w:sz w:val="20"/>
-              </w:rPr>
-              <w:t>ETH+BTC</w:t>
-            </w:r>
-          </w:p>
-        </w:tc>
-        <w:tc>
-          <w:tcPr>
-            <w:tcW w:w="1881" w:type="dxa"/>
-            <w:shd w:val="clear" w:color="auto" w:fill="F0F4F8"/>
-          </w:tcPr>
-          <w:p>
-            <w:pPr>
-              <w:spacing w:line="240" w:lineRule="auto"/>
-            </w:pPr>
-            <w:r>
-              <w:rPr>
-                <w:rFonts w:ascii="Arial" w:hAnsi="Arial" w:eastAsia="微软雅黑"/>
-                <w:sz w:val="20"/>
-              </w:rPr>
-              <w:t>0.537</w:t>
-            </w:r>
-          </w:p>
-        </w:tc>
-        <w:tc>
-          <w:tcPr>
-            <w:tcW w:w="1881" w:type="dxa"/>
-            <w:shd w:val="clear" w:color="auto" w:fill="F0F4F8"/>
-          </w:tcPr>
-          <w:p>
-            <w:pPr>
-              <w:spacing w:line="240" w:lineRule="auto"/>
-            </w:pPr>
-            <w:r>
-              <w:rPr>
-                <w:rFonts w:ascii="Arial" w:hAnsi="Arial" w:eastAsia="微软雅黑"/>
-                <w:sz w:val="20"/>
-              </w:rPr>
-              <w:t>0.0000</w:t>
-            </w:r>
-          </w:p>
-        </w:tc>
-        <w:tc>
-          <w:tcPr>
-            <w:tcW w:w="1881" w:type="dxa"/>
-            <w:shd w:val="clear" w:color="auto" w:fill="F0F4F8"/>
+            <w:tcW w:w="1568" w:type="dxa"/>
+          </w:tcPr>
+          <w:p>
+            <w:pPr>
+              <w:spacing w:line="240" w:lineRule="auto"/>
+            </w:pPr>
+            <w:r>
+              <w:rPr>
+                <w:rFonts w:ascii="Arial" w:hAnsi="Arial" w:eastAsia="微软雅黑"/>
+                <w:sz w:val="20"/>
+              </w:rPr>
+              <w:t>AMZN</w:t>
+            </w:r>
+          </w:p>
+        </w:tc>
+        <w:tc>
+          <w:tcPr>
+            <w:tcW w:w="1568" w:type="dxa"/>
+          </w:tcPr>
+          <w:p>
+            <w:pPr>
+              <w:spacing w:line="240" w:lineRule="auto"/>
+            </w:pPr>
+            <w:r>
+              <w:rPr>
+                <w:rFonts w:ascii="Arial" w:hAnsi="Arial" w:eastAsia="微软雅黑"/>
+                <w:sz w:val="20"/>
+              </w:rPr>
+              <w:t>QQQ+SMH</w:t>
+            </w:r>
+          </w:p>
+        </w:tc>
+        <w:tc>
+          <w:tcPr>
+            <w:tcW w:w="1568" w:type="dxa"/>
+          </w:tcPr>
+          <w:p>
+            <w:pPr>
+              <w:spacing w:line="240" w:lineRule="auto"/>
+            </w:pPr>
+            <w:r>
+              <w:rPr>
+                <w:rFonts w:ascii="Arial" w:hAnsi="Arial" w:eastAsia="微软雅黑"/>
+                <w:sz w:val="20"/>
+              </w:rPr>
+              <w:t>0.536</w:t>
+            </w:r>
+          </w:p>
+        </w:tc>
+        <w:tc>
+          <w:tcPr>
+            <w:tcW w:w="1568" w:type="dxa"/>
+          </w:tcPr>
+          <w:p>
+            <w:pPr>
+              <w:spacing w:line="240" w:lineRule="auto"/>
+            </w:pPr>
+            <w:r>
+              <w:rPr>
+                <w:rFonts w:ascii="Arial" w:hAnsi="Arial" w:eastAsia="微软雅黑"/>
+                <w:sz w:val="20"/>
+              </w:rPr>
+              <w:t>0.00e+00</w:t>
+            </w:r>
+          </w:p>
+        </w:tc>
+        <w:tc>
+          <w:tcPr>
+            <w:tcW w:w="1568" w:type="dxa"/>
+          </w:tcPr>
+          <w:p>
+            <w:pPr>
+              <w:spacing w:line="240" w:lineRule="auto"/>
+            </w:pPr>
+            <w:r>
+              <w:rPr>
+                <w:rFonts w:ascii="Arial" w:hAnsi="Arial" w:eastAsia="微软雅黑"/>
+                <w:sz w:val="20"/>
+              </w:rPr>
+              <w:t>0.0226</w:t>
+            </w:r>
+          </w:p>
+        </w:tc>
+        <w:tc>
+          <w:tcPr>
+            <w:tcW w:w="1568" w:type="dxa"/>
           </w:tcPr>
           <w:p>
             <w:pPr>
@@ -5572,86 +5943,109 @@
         </w:trPr>
         <w:tc>
           <w:tcPr>
-            <w:tcW w:w="1881" w:type="dxa"/>
-          </w:tcPr>
-          <w:p>
-            <w:pPr>
-              <w:spacing w:line="240" w:lineRule="auto"/>
-            </w:pPr>
-            <w:r>
-              <w:rPr>
-                <w:rFonts w:ascii="Arial" w:hAnsi="Arial" w:eastAsia="微软雅黑"/>
-                <w:sz w:val="20"/>
-              </w:rPr>
-              <w:t>AMZN</w:t>
-            </w:r>
-          </w:p>
-        </w:tc>
-        <w:tc>
-          <w:tcPr>
-            <w:tcW w:w="1881" w:type="dxa"/>
-          </w:tcPr>
-          <w:p>
-            <w:pPr>
-              <w:spacing w:line="240" w:lineRule="auto"/>
-            </w:pPr>
-            <w:r>
-              <w:rPr>
-                <w:rFonts w:ascii="Arial" w:hAnsi="Arial" w:eastAsia="微软雅黑"/>
-                <w:sz w:val="20"/>
-              </w:rPr>
-              <w:t>QQQ+SMH</w:t>
-            </w:r>
-          </w:p>
-        </w:tc>
-        <w:tc>
-          <w:tcPr>
-            <w:tcW w:w="1881" w:type="dxa"/>
-          </w:tcPr>
-          <w:p>
-            <w:pPr>
-              <w:spacing w:line="240" w:lineRule="auto"/>
-            </w:pPr>
-            <w:r>
-              <w:rPr>
-                <w:rFonts w:ascii="Arial" w:hAnsi="Arial" w:eastAsia="微软雅黑"/>
-                <w:sz w:val="20"/>
-              </w:rPr>
-              <w:t>0.536</w:t>
-            </w:r>
-          </w:p>
-        </w:tc>
-        <w:tc>
-          <w:tcPr>
-            <w:tcW w:w="1881" w:type="dxa"/>
-          </w:tcPr>
-          <w:p>
-            <w:pPr>
-              <w:spacing w:line="240" w:lineRule="auto"/>
-            </w:pPr>
-            <w:r>
-              <w:rPr>
-                <w:rFonts w:ascii="Arial" w:hAnsi="Arial" w:eastAsia="微软雅黑"/>
-                <w:sz w:val="20"/>
-              </w:rPr>
-              <w:t>0.0000</w:t>
-            </w:r>
-          </w:p>
-        </w:tc>
-        <w:tc>
-          <w:tcPr>
-            <w:tcW w:w="1881" w:type="dxa"/>
-          </w:tcPr>
-          <w:p>
-            <w:pPr>
-              <w:spacing w:line="240" w:lineRule="auto"/>
-            </w:pPr>
-            <w:r>
-              <w:rPr>
-                <w:rFonts w:ascii="Arial" w:hAnsi="Arial" w:eastAsia="微软雅黑"/>
-                <w:sz w:val="20"/>
-              </w:rPr>
-              <w:t>通过</w:t>
+            <w:tcW w:w="1568" w:type="dxa"/>
+            <w:shd w:val="clear" w:color="auto" w:fill="F0F4F8"/>
+          </w:tcPr>
+          <w:p>
+            <w:pPr>
+              <w:spacing w:line="240" w:lineRule="auto"/>
+            </w:pPr>
+            <w:r>
+              <w:rPr>
+                <w:rFonts w:ascii="Arial" w:hAnsi="Arial" w:eastAsia="微软雅黑"/>
+                <w:sz w:val="20"/>
+              </w:rPr>
+              <w:t>MSTR</w:t>
+            </w:r>
+          </w:p>
+        </w:tc>
+        <w:tc>
+          <w:tcPr>
+            <w:tcW w:w="1568" w:type="dxa"/>
+            <w:shd w:val="clear" w:color="auto" w:fill="F0F4F8"/>
+          </w:tcPr>
+          <w:p>
+            <w:pPr>
+              <w:spacing w:line="240" w:lineRule="auto"/>
+            </w:pPr>
+            <w:r>
+              <w:rPr>
+                <w:rFonts w:ascii="Arial" w:hAnsi="Arial" w:eastAsia="微软雅黑"/>
+                <w:sz w:val="20"/>
+              </w:rPr>
+              <w:t>BTC+QQQ</w:t>
+            </w:r>
+          </w:p>
+        </w:tc>
+        <w:tc>
+          <w:tcPr>
+            <w:tcW w:w="1568" w:type="dxa"/>
+            <w:shd w:val="clear" w:color="auto" w:fill="F0F4F8"/>
+          </w:tcPr>
+          <w:p>
+            <w:pPr>
+              <w:spacing w:line="240" w:lineRule="auto"/>
+            </w:pPr>
+            <w:r>
+              <w:rPr>
+                <w:rFonts w:ascii="Arial" w:hAnsi="Arial" w:eastAsia="微软雅黑"/>
+                <w:sz w:val="20"/>
+              </w:rPr>
+              <w:t>0.535</w:t>
+            </w:r>
+          </w:p>
+        </w:tc>
+        <w:tc>
+          <w:tcPr>
+            <w:tcW w:w="1568" w:type="dxa"/>
+            <w:shd w:val="clear" w:color="auto" w:fill="F0F4F8"/>
+          </w:tcPr>
+          <w:p>
+            <w:pPr>
+              <w:spacing w:line="240" w:lineRule="auto"/>
+            </w:pPr>
+            <w:r>
+              <w:rPr>
+                <w:rFonts w:ascii="Arial" w:hAnsi="Arial" w:eastAsia="微软雅黑"/>
+                <w:sz w:val="20"/>
+              </w:rPr>
+              <w:t>0.00e+00</w:t>
+            </w:r>
+          </w:p>
+        </w:tc>
+        <w:tc>
+          <w:tcPr>
+            <w:tcW w:w="1568" w:type="dxa"/>
+            <w:shd w:val="clear" w:color="auto" w:fill="F0F4F8"/>
+          </w:tcPr>
+          <w:p>
+            <w:pPr>
+              <w:spacing w:line="240" w:lineRule="auto"/>
+            </w:pPr>
+            <w:r>
+              <w:rPr>
+                <w:rFonts w:ascii="Arial" w:hAnsi="Arial" w:eastAsia="微软雅黑"/>
+                <w:sz w:val="20"/>
+              </w:rPr>
+              <w:t>0.6320</w:t>
+            </w:r>
+          </w:p>
+        </w:tc>
+        <w:tc>
+          <w:tcPr>
+            <w:tcW w:w="1568" w:type="dxa"/>
+            <w:shd w:val="clear" w:color="auto" w:fill="F0F4F8"/>
+          </w:tcPr>
+          <w:p>
+            <w:pPr>
+              <w:spacing w:line="240" w:lineRule="auto"/>
+            </w:pPr>
+            <w:r>
+              <w:rPr>
+                <w:rFonts w:ascii="Arial" w:hAnsi="Arial" w:eastAsia="微软雅黑"/>
+                <w:sz w:val="20"/>
+              </w:rPr>
+              <w:t>否</w:t>
             </w:r>
           </w:p>
         </w:tc>
@@ -5678,80 +6072,92 @@
         </w:trPr>
         <w:tc>
           <w:tcPr>
-            <w:tcW w:w="1881" w:type="dxa"/>
-            <w:shd w:val="clear" w:color="auto" w:fill="F0F4F8"/>
-          </w:tcPr>
-          <w:p>
-            <w:pPr>
-              <w:spacing w:line="240" w:lineRule="auto"/>
-            </w:pPr>
-            <w:r>
-              <w:rPr>
-                <w:rFonts w:ascii="Arial" w:hAnsi="Arial" w:eastAsia="微软雅黑"/>
-                <w:sz w:val="20"/>
-              </w:rPr>
-              <w:t>MSTR</w:t>
-            </w:r>
-          </w:p>
-        </w:tc>
-        <w:tc>
-          <w:tcPr>
-            <w:tcW w:w="1881" w:type="dxa"/>
-            <w:shd w:val="clear" w:color="auto" w:fill="F0F4F8"/>
-          </w:tcPr>
-          <w:p>
-            <w:pPr>
-              <w:spacing w:line="240" w:lineRule="auto"/>
-            </w:pPr>
-            <w:r>
-              <w:rPr>
-                <w:rFonts w:ascii="Arial" w:hAnsi="Arial" w:eastAsia="微软雅黑"/>
-                <w:sz w:val="20"/>
-              </w:rPr>
-              <w:t>BTC+QQQ</w:t>
-            </w:r>
-          </w:p>
-        </w:tc>
-        <w:tc>
-          <w:tcPr>
-            <w:tcW w:w="1881" w:type="dxa"/>
-            <w:shd w:val="clear" w:color="auto" w:fill="F0F4F8"/>
-          </w:tcPr>
-          <w:p>
-            <w:pPr>
-              <w:spacing w:line="240" w:lineRule="auto"/>
-            </w:pPr>
-            <w:r>
-              <w:rPr>
-                <w:rFonts w:ascii="Arial" w:hAnsi="Arial" w:eastAsia="微软雅黑"/>
-                <w:sz w:val="20"/>
-              </w:rPr>
-              <w:t>0.535</w:t>
-            </w:r>
-          </w:p>
-        </w:tc>
-        <w:tc>
-          <w:tcPr>
-            <w:tcW w:w="1881" w:type="dxa"/>
-            <w:shd w:val="clear" w:color="auto" w:fill="F0F4F8"/>
-          </w:tcPr>
-          <w:p>
-            <w:pPr>
-              <w:spacing w:line="240" w:lineRule="auto"/>
-            </w:pPr>
-            <w:r>
-              <w:rPr>
-                <w:rFonts w:ascii="Arial" w:hAnsi="Arial" w:eastAsia="微软雅黑"/>
-                <w:sz w:val="20"/>
-              </w:rPr>
-              <w:t>0.0000</w:t>
-            </w:r>
-          </w:p>
-        </w:tc>
-        <w:tc>
-          <w:tcPr>
-            <w:tcW w:w="1881" w:type="dxa"/>
-            <w:shd w:val="clear" w:color="auto" w:fill="F0F4F8"/>
+            <w:tcW w:w="1568" w:type="dxa"/>
+          </w:tcPr>
+          <w:p>
+            <w:pPr>
+              <w:spacing w:line="240" w:lineRule="auto"/>
+            </w:pPr>
+            <w:r>
+              <w:rPr>
+                <w:rFonts w:ascii="Arial" w:hAnsi="Arial" w:eastAsia="微软雅黑"/>
+                <w:sz w:val="20"/>
+              </w:rPr>
+              <w:t>MSFT</w:t>
+            </w:r>
+          </w:p>
+        </w:tc>
+        <w:tc>
+          <w:tcPr>
+            <w:tcW w:w="1568" w:type="dxa"/>
+          </w:tcPr>
+          <w:p>
+            <w:pPr>
+              <w:spacing w:line="240" w:lineRule="auto"/>
+            </w:pPr>
+            <w:r>
+              <w:rPr>
+                <w:rFonts w:ascii="Arial" w:hAnsi="Arial" w:eastAsia="微软雅黑"/>
+                <w:sz w:val="20"/>
+              </w:rPr>
+              <w:t>QQQ+SMH</w:t>
+            </w:r>
+          </w:p>
+        </w:tc>
+        <w:tc>
+          <w:tcPr>
+            <w:tcW w:w="1568" w:type="dxa"/>
+          </w:tcPr>
+          <w:p>
+            <w:pPr>
+              <w:spacing w:line="240" w:lineRule="auto"/>
+            </w:pPr>
+            <w:r>
+              <w:rPr>
+                <w:rFonts w:ascii="Arial" w:hAnsi="Arial" w:eastAsia="微软雅黑"/>
+                <w:sz w:val="20"/>
+              </w:rPr>
+              <w:t>0.529</w:t>
+            </w:r>
+          </w:p>
+        </w:tc>
+        <w:tc>
+          <w:tcPr>
+            <w:tcW w:w="1568" w:type="dxa"/>
+          </w:tcPr>
+          <w:p>
+            <w:pPr>
+              <w:spacing w:line="240" w:lineRule="auto"/>
+            </w:pPr>
+            <w:r>
+              <w:rPr>
+                <w:rFonts w:ascii="Arial" w:hAnsi="Arial" w:eastAsia="微软雅黑"/>
+                <w:sz w:val="20"/>
+              </w:rPr>
+              <w:t>6.92e-30</w:t>
+            </w:r>
+          </w:p>
+        </w:tc>
+        <w:tc>
+          <w:tcPr>
+            <w:tcW w:w="1568" w:type="dxa"/>
+          </w:tcPr>
+          <w:p>
+            <w:pPr>
+              <w:spacing w:line="240" w:lineRule="auto"/>
+            </w:pPr>
+            <w:r>
+              <w:rPr>
+                <w:rFonts w:ascii="Arial" w:hAnsi="Arial" w:eastAsia="微软雅黑"/>
+                <w:sz w:val="20"/>
+              </w:rPr>
+              <w:t>0.2060</w:t>
+            </w:r>
+          </w:p>
+        </w:tc>
+        <w:tc>
+          <w:tcPr>
+            <w:tcW w:w="1568" w:type="dxa"/>
           </w:tcPr>
           <w:p>
             <w:pPr>
@@ -5789,86 +6195,109 @@
         </w:trPr>
         <w:tc>
           <w:tcPr>
-            <w:tcW w:w="1881" w:type="dxa"/>
-          </w:tcPr>
-          <w:p>
-            <w:pPr>
-              <w:spacing w:line="240" w:lineRule="auto"/>
-            </w:pPr>
-            <w:r>
-              <w:rPr>
-                <w:rFonts w:ascii="Arial" w:hAnsi="Arial" w:eastAsia="微软雅黑"/>
-                <w:sz w:val="20"/>
-              </w:rPr>
-              <w:t>MSFT</w:t>
-            </w:r>
-          </w:p>
-        </w:tc>
-        <w:tc>
-          <w:tcPr>
-            <w:tcW w:w="1881" w:type="dxa"/>
-          </w:tcPr>
-          <w:p>
-            <w:pPr>
-              <w:spacing w:line="240" w:lineRule="auto"/>
-            </w:pPr>
-            <w:r>
-              <w:rPr>
-                <w:rFonts w:ascii="Arial" w:hAnsi="Arial" w:eastAsia="微软雅黑"/>
-                <w:sz w:val="20"/>
-              </w:rPr>
-              <w:t>QQQ+SMH</w:t>
-            </w:r>
-          </w:p>
-        </w:tc>
-        <w:tc>
-          <w:tcPr>
-            <w:tcW w:w="1881" w:type="dxa"/>
-          </w:tcPr>
-          <w:p>
-            <w:pPr>
-              <w:spacing w:line="240" w:lineRule="auto"/>
-            </w:pPr>
-            <w:r>
-              <w:rPr>
-                <w:rFonts w:ascii="Arial" w:hAnsi="Arial" w:eastAsia="微软雅黑"/>
-                <w:sz w:val="20"/>
-              </w:rPr>
-              <w:t>0.529</w:t>
-            </w:r>
-          </w:p>
-        </w:tc>
-        <w:tc>
-          <w:tcPr>
-            <w:tcW w:w="1881" w:type="dxa"/>
-          </w:tcPr>
-          <w:p>
-            <w:pPr>
-              <w:spacing w:line="240" w:lineRule="auto"/>
-            </w:pPr>
-            <w:r>
-              <w:rPr>
-                <w:rFonts w:ascii="Arial" w:hAnsi="Arial" w:eastAsia="微软雅黑"/>
-                <w:sz w:val="20"/>
-              </w:rPr>
-              <w:t>0.0000</w:t>
-            </w:r>
-          </w:p>
-        </w:tc>
-        <w:tc>
-          <w:tcPr>
-            <w:tcW w:w="1881" w:type="dxa"/>
-          </w:tcPr>
-          <w:p>
-            <w:pPr>
-              <w:spacing w:line="240" w:lineRule="auto"/>
-            </w:pPr>
-            <w:r>
-              <w:rPr>
-                <w:rFonts w:ascii="Arial" w:hAnsi="Arial" w:eastAsia="微软雅黑"/>
-                <w:sz w:val="20"/>
-              </w:rPr>
-              <w:t>通过</w:t>
+            <w:tcW w:w="1568" w:type="dxa"/>
+            <w:shd w:val="clear" w:color="auto" w:fill="F0F4F8"/>
+          </w:tcPr>
+          <w:p>
+            <w:pPr>
+              <w:spacing w:line="240" w:lineRule="auto"/>
+            </w:pPr>
+            <w:r>
+              <w:rPr>
+                <w:rFonts w:ascii="Arial" w:hAnsi="Arial" w:eastAsia="微软雅黑"/>
+                <w:sz w:val="20"/>
+              </w:rPr>
+              <w:t>XRP</w:t>
+            </w:r>
+          </w:p>
+        </w:tc>
+        <w:tc>
+          <w:tcPr>
+            <w:tcW w:w="1568" w:type="dxa"/>
+            <w:shd w:val="clear" w:color="auto" w:fill="F0F4F8"/>
+          </w:tcPr>
+          <w:p>
+            <w:pPr>
+              <w:spacing w:line="240" w:lineRule="auto"/>
+            </w:pPr>
+            <w:r>
+              <w:rPr>
+                <w:rFonts w:ascii="Arial" w:hAnsi="Arial" w:eastAsia="微软雅黑"/>
+                <w:sz w:val="20"/>
+              </w:rPr>
+              <w:t>BTC+ETH</w:t>
+            </w:r>
+          </w:p>
+        </w:tc>
+        <w:tc>
+          <w:tcPr>
+            <w:tcW w:w="1568" w:type="dxa"/>
+            <w:shd w:val="clear" w:color="auto" w:fill="F0F4F8"/>
+          </w:tcPr>
+          <w:p>
+            <w:pPr>
+              <w:spacing w:line="240" w:lineRule="auto"/>
+            </w:pPr>
+            <w:r>
+              <w:rPr>
+                <w:rFonts w:ascii="Arial" w:hAnsi="Arial" w:eastAsia="微软雅黑"/>
+                <w:sz w:val="20"/>
+              </w:rPr>
+              <w:t>0.471</w:t>
+            </w:r>
+          </w:p>
+        </w:tc>
+        <w:tc>
+          <w:tcPr>
+            <w:tcW w:w="1568" w:type="dxa"/>
+            <w:shd w:val="clear" w:color="auto" w:fill="F0F4F8"/>
+          </w:tcPr>
+          <w:p>
+            <w:pPr>
+              <w:spacing w:line="240" w:lineRule="auto"/>
+            </w:pPr>
+            <w:r>
+              <w:rPr>
+                <w:rFonts w:ascii="Arial" w:hAnsi="Arial" w:eastAsia="微软雅黑"/>
+                <w:sz w:val="20"/>
+              </w:rPr>
+              <w:t>0.00e+00</w:t>
+            </w:r>
+          </w:p>
+        </w:tc>
+        <w:tc>
+          <w:tcPr>
+            <w:tcW w:w="1568" w:type="dxa"/>
+            <w:shd w:val="clear" w:color="auto" w:fill="F0F4F8"/>
+          </w:tcPr>
+          <w:p>
+            <w:pPr>
+              <w:spacing w:line="240" w:lineRule="auto"/>
+            </w:pPr>
+            <w:r>
+              <w:rPr>
+                <w:rFonts w:ascii="Arial" w:hAnsi="Arial" w:eastAsia="微软雅黑"/>
+                <w:sz w:val="20"/>
+              </w:rPr>
+              <w:t>0.6410</w:t>
+            </w:r>
+          </w:p>
+        </w:tc>
+        <w:tc>
+          <w:tcPr>
+            <w:tcW w:w="1568" w:type="dxa"/>
+            <w:shd w:val="clear" w:color="auto" w:fill="F0F4F8"/>
+          </w:tcPr>
+          <w:p>
+            <w:pPr>
+              <w:spacing w:line="240" w:lineRule="auto"/>
+            </w:pPr>
+            <w:r>
+              <w:rPr>
+                <w:rFonts w:ascii="Arial" w:hAnsi="Arial" w:eastAsia="微软雅黑"/>
+                <w:sz w:val="20"/>
+              </w:rPr>
+              <w:t>否</w:t>
             </w:r>
           </w:p>
         </w:tc>
@@ -5895,80 +6324,92 @@
         </w:trPr>
         <w:tc>
           <w:tcPr>
-            <w:tcW w:w="1881" w:type="dxa"/>
-            <w:shd w:val="clear" w:color="auto" w:fill="F0F4F8"/>
-          </w:tcPr>
-          <w:p>
-            <w:pPr>
-              <w:spacing w:line="240" w:lineRule="auto"/>
-            </w:pPr>
-            <w:r>
-              <w:rPr>
-                <w:rFonts w:ascii="Arial" w:hAnsi="Arial" w:eastAsia="微软雅黑"/>
-                <w:sz w:val="20"/>
-              </w:rPr>
-              <w:t>XRP</w:t>
-            </w:r>
-          </w:p>
-        </w:tc>
-        <w:tc>
-          <w:tcPr>
-            <w:tcW w:w="1881" w:type="dxa"/>
-            <w:shd w:val="clear" w:color="auto" w:fill="F0F4F8"/>
-          </w:tcPr>
-          <w:p>
-            <w:pPr>
-              <w:spacing w:line="240" w:lineRule="auto"/>
-            </w:pPr>
-            <w:r>
-              <w:rPr>
-                <w:rFonts w:ascii="Arial" w:hAnsi="Arial" w:eastAsia="微软雅黑"/>
-                <w:sz w:val="20"/>
-              </w:rPr>
-              <w:t>BTC+ETH</w:t>
-            </w:r>
-          </w:p>
-        </w:tc>
-        <w:tc>
-          <w:tcPr>
-            <w:tcW w:w="1881" w:type="dxa"/>
-            <w:shd w:val="clear" w:color="auto" w:fill="F0F4F8"/>
-          </w:tcPr>
-          <w:p>
-            <w:pPr>
-              <w:spacing w:line="240" w:lineRule="auto"/>
-            </w:pPr>
-            <w:r>
-              <w:rPr>
-                <w:rFonts w:ascii="Arial" w:hAnsi="Arial" w:eastAsia="微软雅黑"/>
-                <w:sz w:val="20"/>
-              </w:rPr>
-              <w:t>0.471</w:t>
-            </w:r>
-          </w:p>
-        </w:tc>
-        <w:tc>
-          <w:tcPr>
-            <w:tcW w:w="1881" w:type="dxa"/>
-            <w:shd w:val="clear" w:color="auto" w:fill="F0F4F8"/>
-          </w:tcPr>
-          <w:p>
-            <w:pPr>
-              <w:spacing w:line="240" w:lineRule="auto"/>
-            </w:pPr>
-            <w:r>
-              <w:rPr>
-                <w:rFonts w:ascii="Arial" w:hAnsi="Arial" w:eastAsia="微软雅黑"/>
-                <w:sz w:val="20"/>
-              </w:rPr>
-              <w:t>0.0000</w:t>
-            </w:r>
-          </w:p>
-        </w:tc>
-        <w:tc>
-          <w:tcPr>
-            <w:tcW w:w="1881" w:type="dxa"/>
-            <w:shd w:val="clear" w:color="auto" w:fill="F0F4F8"/>
+            <w:tcW w:w="1568" w:type="dxa"/>
+          </w:tcPr>
+          <w:p>
+            <w:pPr>
+              <w:spacing w:line="240" w:lineRule="auto"/>
+            </w:pPr>
+            <w:r>
+              <w:rPr>
+                <w:rFonts w:ascii="Arial" w:hAnsi="Arial" w:eastAsia="微软雅黑"/>
+                <w:sz w:val="20"/>
+              </w:rPr>
+              <w:t>COIN</w:t>
+            </w:r>
+          </w:p>
+        </w:tc>
+        <w:tc>
+          <w:tcPr>
+            <w:tcW w:w="1568" w:type="dxa"/>
+          </w:tcPr>
+          <w:p>
+            <w:pPr>
+              <w:spacing w:line="240" w:lineRule="auto"/>
+            </w:pPr>
+            <w:r>
+              <w:rPr>
+                <w:rFonts w:ascii="Arial" w:hAnsi="Arial" w:eastAsia="微软雅黑"/>
+                <w:sz w:val="20"/>
+              </w:rPr>
+              <w:t>BTC+ETH+QQQ</w:t>
+            </w:r>
+          </w:p>
+        </w:tc>
+        <w:tc>
+          <w:tcPr>
+            <w:tcW w:w="1568" w:type="dxa"/>
+          </w:tcPr>
+          <w:p>
+            <w:pPr>
+              <w:spacing w:line="240" w:lineRule="auto"/>
+            </w:pPr>
+            <w:r>
+              <w:rPr>
+                <w:rFonts w:ascii="Arial" w:hAnsi="Arial" w:eastAsia="微软雅黑"/>
+                <w:sz w:val="20"/>
+              </w:rPr>
+              <w:t>0.454</w:t>
+            </w:r>
+          </w:p>
+        </w:tc>
+        <w:tc>
+          <w:tcPr>
+            <w:tcW w:w="1568" w:type="dxa"/>
+          </w:tcPr>
+          <w:p>
+            <w:pPr>
+              <w:spacing w:line="240" w:lineRule="auto"/>
+            </w:pPr>
+            <w:r>
+              <w:rPr>
+                <w:rFonts w:ascii="Arial" w:hAnsi="Arial" w:eastAsia="微软雅黑"/>
+                <w:sz w:val="20"/>
+              </w:rPr>
+              <w:t>0.00e+00</w:t>
+            </w:r>
+          </w:p>
+        </w:tc>
+        <w:tc>
+          <w:tcPr>
+            <w:tcW w:w="1568" w:type="dxa"/>
+          </w:tcPr>
+          <w:p>
+            <w:pPr>
+              <w:spacing w:line="240" w:lineRule="auto"/>
+            </w:pPr>
+            <w:r>
+              <w:rPr>
+                <w:rFonts w:ascii="Arial" w:hAnsi="Arial" w:eastAsia="微软雅黑"/>
+                <w:sz w:val="20"/>
+              </w:rPr>
+              <w:t>0.0963</w:t>
+            </w:r>
+          </w:p>
+        </w:tc>
+        <w:tc>
+          <w:tcPr>
+            <w:tcW w:w="1568" w:type="dxa"/>
           </w:tcPr>
           <w:p>
             <w:pPr>
@@ -6006,75 +6447,98 @@
         </w:trPr>
         <w:tc>
           <w:tcPr>
-            <w:tcW w:w="1881" w:type="dxa"/>
-          </w:tcPr>
-          <w:p>
-            <w:pPr>
-              <w:spacing w:line="240" w:lineRule="auto"/>
-            </w:pPr>
-            <w:r>
-              <w:rPr>
-                <w:rFonts w:ascii="Arial" w:hAnsi="Arial" w:eastAsia="微软雅黑"/>
-                <w:sz w:val="20"/>
-              </w:rPr>
-              <w:t>COIN</w:t>
-            </w:r>
-          </w:p>
-        </w:tc>
-        <w:tc>
-          <w:tcPr>
-            <w:tcW w:w="1881" w:type="dxa"/>
-          </w:tcPr>
-          <w:p>
-            <w:pPr>
-              <w:spacing w:line="240" w:lineRule="auto"/>
-            </w:pPr>
-            <w:r>
-              <w:rPr>
-                <w:rFonts w:ascii="Arial" w:hAnsi="Arial" w:eastAsia="微软雅黑"/>
-                <w:sz w:val="20"/>
-              </w:rPr>
-              <w:t>BTC+ETH+QQQ</w:t>
-            </w:r>
-          </w:p>
-        </w:tc>
-        <w:tc>
-          <w:tcPr>
-            <w:tcW w:w="1881" w:type="dxa"/>
-          </w:tcPr>
-          <w:p>
-            <w:pPr>
-              <w:spacing w:line="240" w:lineRule="auto"/>
-            </w:pPr>
-            <w:r>
-              <w:rPr>
-                <w:rFonts w:ascii="Arial" w:hAnsi="Arial" w:eastAsia="微软雅黑"/>
-                <w:sz w:val="20"/>
-              </w:rPr>
-              <w:t>0.454</w:t>
-            </w:r>
-          </w:p>
-        </w:tc>
-        <w:tc>
-          <w:tcPr>
-            <w:tcW w:w="1881" w:type="dxa"/>
-          </w:tcPr>
-          <w:p>
-            <w:pPr>
-              <w:spacing w:line="240" w:lineRule="auto"/>
-            </w:pPr>
-            <w:r>
-              <w:rPr>
-                <w:rFonts w:ascii="Arial" w:hAnsi="Arial" w:eastAsia="微软雅黑"/>
-                <w:sz w:val="20"/>
-              </w:rPr>
-              <w:t>0.0000</w:t>
-            </w:r>
-          </w:p>
-        </w:tc>
-        <w:tc>
-          <w:tcPr>
-            <w:tcW w:w="1881" w:type="dxa"/>
+            <w:tcW w:w="1568" w:type="dxa"/>
+            <w:shd w:val="clear" w:color="auto" w:fill="F0F4F8"/>
+          </w:tcPr>
+          <w:p>
+            <w:pPr>
+              <w:spacing w:line="240" w:lineRule="auto"/>
+            </w:pPr>
+            <w:r>
+              <w:rPr>
+                <w:rFonts w:ascii="Arial" w:hAnsi="Arial" w:eastAsia="微软雅黑"/>
+                <w:sz w:val="20"/>
+              </w:rPr>
+              <w:t>META</w:t>
+            </w:r>
+          </w:p>
+        </w:tc>
+        <w:tc>
+          <w:tcPr>
+            <w:tcW w:w="1568" w:type="dxa"/>
+            <w:shd w:val="clear" w:color="auto" w:fill="F0F4F8"/>
+          </w:tcPr>
+          <w:p>
+            <w:pPr>
+              <w:spacing w:line="240" w:lineRule="auto"/>
+            </w:pPr>
+            <w:r>
+              <w:rPr>
+                <w:rFonts w:ascii="Arial" w:hAnsi="Arial" w:eastAsia="微软雅黑"/>
+                <w:sz w:val="20"/>
+              </w:rPr>
+              <w:t>QQQ+SMH</w:t>
+            </w:r>
+          </w:p>
+        </w:tc>
+        <w:tc>
+          <w:tcPr>
+            <w:tcW w:w="1568" w:type="dxa"/>
+            <w:shd w:val="clear" w:color="auto" w:fill="F0F4F8"/>
+          </w:tcPr>
+          <w:p>
+            <w:pPr>
+              <w:spacing w:line="240" w:lineRule="auto"/>
+            </w:pPr>
+            <w:r>
+              <w:rPr>
+                <w:rFonts w:ascii="Arial" w:hAnsi="Arial" w:eastAsia="微软雅黑"/>
+                <w:sz w:val="20"/>
+              </w:rPr>
+              <w:t>0.440</w:t>
+            </w:r>
+          </w:p>
+        </w:tc>
+        <w:tc>
+          <w:tcPr>
+            <w:tcW w:w="1568" w:type="dxa"/>
+            <w:shd w:val="clear" w:color="auto" w:fill="F0F4F8"/>
+          </w:tcPr>
+          <w:p>
+            <w:pPr>
+              <w:spacing w:line="240" w:lineRule="auto"/>
+            </w:pPr>
+            <w:r>
+              <w:rPr>
+                <w:rFonts w:ascii="Arial" w:hAnsi="Arial" w:eastAsia="微软雅黑"/>
+                <w:sz w:val="20"/>
+              </w:rPr>
+              <w:t>0.00e+00</w:t>
+            </w:r>
+          </w:p>
+        </w:tc>
+        <w:tc>
+          <w:tcPr>
+            <w:tcW w:w="1568" w:type="dxa"/>
+            <w:shd w:val="clear" w:color="auto" w:fill="F0F4F8"/>
+          </w:tcPr>
+          <w:p>
+            <w:pPr>
+              <w:spacing w:line="240" w:lineRule="auto"/>
+            </w:pPr>
+            <w:r>
+              <w:rPr>
+                <w:rFonts w:ascii="Arial" w:hAnsi="Arial" w:eastAsia="微软雅黑"/>
+                <w:sz w:val="20"/>
+              </w:rPr>
+              <w:t>0.5391</w:t>
+            </w:r>
+          </w:p>
+        </w:tc>
+        <w:tc>
+          <w:tcPr>
+            <w:tcW w:w="1568" w:type="dxa"/>
+            <w:shd w:val="clear" w:color="auto" w:fill="F0F4F8"/>
           </w:tcPr>
           <w:p>
             <w:pPr>
@@ -6112,26 +6576,24 @@
         </w:trPr>
         <w:tc>
           <w:tcPr>
-            <w:tcW w:w="1881" w:type="dxa"/>
-            <w:shd w:val="clear" w:color="auto" w:fill="F0F4F8"/>
-          </w:tcPr>
-          <w:p>
-            <w:pPr>
-              <w:spacing w:line="240" w:lineRule="auto"/>
-            </w:pPr>
-            <w:r>
-              <w:rPr>
-                <w:rFonts w:ascii="Arial" w:hAnsi="Arial" w:eastAsia="微软雅黑"/>
-                <w:sz w:val="20"/>
-              </w:rPr>
-              <w:t>META</w:t>
-            </w:r>
-          </w:p>
-        </w:tc>
-        <w:tc>
-          <w:tcPr>
-            <w:tcW w:w="1881" w:type="dxa"/>
-            <w:shd w:val="clear" w:color="auto" w:fill="F0F4F8"/>
+            <w:tcW w:w="1568" w:type="dxa"/>
+          </w:tcPr>
+          <w:p>
+            <w:pPr>
+              <w:spacing w:line="240" w:lineRule="auto"/>
+            </w:pPr>
+            <w:r>
+              <w:rPr>
+                <w:rFonts w:ascii="Arial" w:hAnsi="Arial" w:eastAsia="微软雅黑"/>
+                <w:sz w:val="20"/>
+              </w:rPr>
+              <w:t>AAPL</w:t>
+            </w:r>
+          </w:p>
+        </w:tc>
+        <w:tc>
+          <w:tcPr>
+            <w:tcW w:w="1568" w:type="dxa"/>
           </w:tcPr>
           <w:p>
             <w:pPr>
@@ -6148,44 +6610,58 @@
         </w:tc>
         <w:tc>
           <w:tcPr>
-            <w:tcW w:w="1881" w:type="dxa"/>
-            <w:shd w:val="clear" w:color="auto" w:fill="F0F4F8"/>
-          </w:tcPr>
-          <w:p>
-            <w:pPr>
-              <w:spacing w:line="240" w:lineRule="auto"/>
-            </w:pPr>
-            <w:r>
-              <w:rPr>
-                <w:rFonts w:ascii="Arial" w:hAnsi="Arial" w:eastAsia="微软雅黑"/>
-                <w:sz w:val="20"/>
-              </w:rPr>
-              <w:t>0.440</w:t>
-            </w:r>
-          </w:p>
-        </w:tc>
-        <w:tc>
-          <w:tcPr>
-            <w:tcW w:w="1881" w:type="dxa"/>
-            <w:shd w:val="clear" w:color="auto" w:fill="F0F4F8"/>
-          </w:tcPr>
-          <w:p>
-            <w:pPr>
-              <w:spacing w:line="240" w:lineRule="auto"/>
-            </w:pPr>
-            <w:r>
-              <w:rPr>
-                <w:rFonts w:ascii="Arial" w:hAnsi="Arial" w:eastAsia="微软雅黑"/>
-                <w:sz w:val="20"/>
-              </w:rPr>
-              <w:t>0.0000</w:t>
-            </w:r>
-          </w:p>
-        </w:tc>
-        <w:tc>
-          <w:tcPr>
-            <w:tcW w:w="1881" w:type="dxa"/>
-            <w:shd w:val="clear" w:color="auto" w:fill="F0F4F8"/>
+            <w:tcW w:w="1568" w:type="dxa"/>
+          </w:tcPr>
+          <w:p>
+            <w:pPr>
+              <w:spacing w:line="240" w:lineRule="auto"/>
+            </w:pPr>
+            <w:r>
+              <w:rPr>
+                <w:rFonts w:ascii="Arial" w:hAnsi="Arial" w:eastAsia="微软雅黑"/>
+                <w:sz w:val="20"/>
+              </w:rPr>
+              <w:t>0.434</w:t>
+            </w:r>
+          </w:p>
+        </w:tc>
+        <w:tc>
+          <w:tcPr>
+            <w:tcW w:w="1568" w:type="dxa"/>
+          </w:tcPr>
+          <w:p>
+            <w:pPr>
+              <w:spacing w:line="240" w:lineRule="auto"/>
+            </w:pPr>
+            <w:r>
+              <w:rPr>
+                <w:rFonts w:ascii="Arial" w:hAnsi="Arial" w:eastAsia="微软雅黑"/>
+                <w:sz w:val="20"/>
+              </w:rPr>
+              <w:t>1.58e-25</w:t>
+            </w:r>
+          </w:p>
+        </w:tc>
+        <w:tc>
+          <w:tcPr>
+            <w:tcW w:w="1568" w:type="dxa"/>
+          </w:tcPr>
+          <w:p>
+            <w:pPr>
+              <w:spacing w:line="240" w:lineRule="auto"/>
+            </w:pPr>
+            <w:r>
+              <w:rPr>
+                <w:rFonts w:ascii="Arial" w:hAnsi="Arial" w:eastAsia="微软雅黑"/>
+                <w:sz w:val="20"/>
+              </w:rPr>
+              <w:t>0.3526</w:t>
+            </w:r>
+          </w:p>
+        </w:tc>
+        <w:tc>
+          <w:tcPr>
+            <w:tcW w:w="1568" w:type="dxa"/>
           </w:tcPr>
           <w:p>
             <w:pPr>
@@ -6223,24 +6699,26 @@
         </w:trPr>
         <w:tc>
           <w:tcPr>
-            <w:tcW w:w="1881" w:type="dxa"/>
-          </w:tcPr>
-          <w:p>
-            <w:pPr>
-              <w:spacing w:line="240" w:lineRule="auto"/>
-            </w:pPr>
-            <w:r>
-              <w:rPr>
-                <w:rFonts w:ascii="Arial" w:hAnsi="Arial" w:eastAsia="微软雅黑"/>
-                <w:sz w:val="20"/>
-              </w:rPr>
-              <w:t>AAPL</w:t>
-            </w:r>
-          </w:p>
-        </w:tc>
-        <w:tc>
-          <w:tcPr>
-            <w:tcW w:w="1881" w:type="dxa"/>
+            <w:tcW w:w="1568" w:type="dxa"/>
+            <w:shd w:val="clear" w:color="auto" w:fill="F0F4F8"/>
+          </w:tcPr>
+          <w:p>
+            <w:pPr>
+              <w:spacing w:line="240" w:lineRule="auto"/>
+            </w:pPr>
+            <w:r>
+              <w:rPr>
+                <w:rFonts w:ascii="Arial" w:hAnsi="Arial" w:eastAsia="微软雅黑"/>
+                <w:sz w:val="20"/>
+              </w:rPr>
+              <w:t>GOOGL</w:t>
+            </w:r>
+          </w:p>
+        </w:tc>
+        <w:tc>
+          <w:tcPr>
+            <w:tcW w:w="1568" w:type="dxa"/>
+            <w:shd w:val="clear" w:color="auto" w:fill="F0F4F8"/>
           </w:tcPr>
           <w:p>
             <w:pPr>
@@ -6257,41 +6735,62 @@
         </w:tc>
         <w:tc>
           <w:tcPr>
-            <w:tcW w:w="1881" w:type="dxa"/>
-          </w:tcPr>
-          <w:p>
-            <w:pPr>
-              <w:spacing w:line="240" w:lineRule="auto"/>
-            </w:pPr>
-            <w:r>
-              <w:rPr>
-                <w:rFonts w:ascii="Arial" w:hAnsi="Arial" w:eastAsia="微软雅黑"/>
-                <w:sz w:val="20"/>
-              </w:rPr>
-              <w:t>0.434</w:t>
-            </w:r>
-          </w:p>
-        </w:tc>
-        <w:tc>
-          <w:tcPr>
-            <w:tcW w:w="1881" w:type="dxa"/>
-          </w:tcPr>
-          <w:p>
-            <w:pPr>
-              <w:spacing w:line="240" w:lineRule="auto"/>
-            </w:pPr>
-            <w:r>
-              <w:rPr>
-                <w:rFonts w:ascii="Arial" w:hAnsi="Arial" w:eastAsia="微软雅黑"/>
-                <w:sz w:val="20"/>
-              </w:rPr>
-              <w:t>0.0000</w:t>
-            </w:r>
-          </w:p>
-        </w:tc>
-        <w:tc>
-          <w:tcPr>
-            <w:tcW w:w="1881" w:type="dxa"/>
+            <w:tcW w:w="1568" w:type="dxa"/>
+            <w:shd w:val="clear" w:color="auto" w:fill="F0F4F8"/>
+          </w:tcPr>
+          <w:p>
+            <w:pPr>
+              <w:spacing w:line="240" w:lineRule="auto"/>
+            </w:pPr>
+            <w:r>
+              <w:rPr>
+                <w:rFonts w:ascii="Arial" w:hAnsi="Arial" w:eastAsia="微软雅黑"/>
+                <w:sz w:val="20"/>
+              </w:rPr>
+              <w:t>0.424</w:t>
+            </w:r>
+          </w:p>
+        </w:tc>
+        <w:tc>
+          <w:tcPr>
+            <w:tcW w:w="1568" w:type="dxa"/>
+            <w:shd w:val="clear" w:color="auto" w:fill="F0F4F8"/>
+          </w:tcPr>
+          <w:p>
+            <w:pPr>
+              <w:spacing w:line="240" w:lineRule="auto"/>
+            </w:pPr>
+            <w:r>
+              <w:rPr>
+                <w:rFonts w:ascii="Arial" w:hAnsi="Arial" w:eastAsia="微软雅黑"/>
+                <w:sz w:val="20"/>
+              </w:rPr>
+              <w:t>0.00e+00</w:t>
+            </w:r>
+          </w:p>
+        </w:tc>
+        <w:tc>
+          <w:tcPr>
+            <w:tcW w:w="1568" w:type="dxa"/>
+            <w:shd w:val="clear" w:color="auto" w:fill="F0F4F8"/>
+          </w:tcPr>
+          <w:p>
+            <w:pPr>
+              <w:spacing w:line="240" w:lineRule="auto"/>
+            </w:pPr>
+            <w:r>
+              <w:rPr>
+                <w:rFonts w:ascii="Arial" w:hAnsi="Arial" w:eastAsia="微软雅黑"/>
+                <w:sz w:val="20"/>
+              </w:rPr>
+              <w:t>0.4847</w:t>
+            </w:r>
+          </w:p>
+        </w:tc>
+        <w:tc>
+          <w:tcPr>
+            <w:tcW w:w="1568" w:type="dxa"/>
+            <w:shd w:val="clear" w:color="auto" w:fill="F0F4F8"/>
           </w:tcPr>
           <w:p>
             <w:pPr>
@@ -6329,80 +6828,92 @@
         </w:trPr>
         <w:tc>
           <w:tcPr>
-            <w:tcW w:w="1881" w:type="dxa"/>
-            <w:shd w:val="clear" w:color="auto" w:fill="F0F4F8"/>
-          </w:tcPr>
-          <w:p>
-            <w:pPr>
-              <w:spacing w:line="240" w:lineRule="auto"/>
-            </w:pPr>
-            <w:r>
-              <w:rPr>
-                <w:rFonts w:ascii="Arial" w:hAnsi="Arial" w:eastAsia="微软雅黑"/>
-                <w:sz w:val="20"/>
-              </w:rPr>
-              <w:t>GOOGL</w:t>
-            </w:r>
-          </w:p>
-        </w:tc>
-        <w:tc>
-          <w:tcPr>
-            <w:tcW w:w="1881" w:type="dxa"/>
-            <w:shd w:val="clear" w:color="auto" w:fill="F0F4F8"/>
-          </w:tcPr>
-          <w:p>
-            <w:pPr>
-              <w:spacing w:line="240" w:lineRule="auto"/>
-            </w:pPr>
-            <w:r>
-              <w:rPr>
-                <w:rFonts w:ascii="Arial" w:hAnsi="Arial" w:eastAsia="微软雅黑"/>
-                <w:sz w:val="20"/>
-              </w:rPr>
-              <w:t>QQQ+SMH</w:t>
-            </w:r>
-          </w:p>
-        </w:tc>
-        <w:tc>
-          <w:tcPr>
-            <w:tcW w:w="1881" w:type="dxa"/>
-            <w:shd w:val="clear" w:color="auto" w:fill="F0F4F8"/>
-          </w:tcPr>
-          <w:p>
-            <w:pPr>
-              <w:spacing w:line="240" w:lineRule="auto"/>
-            </w:pPr>
-            <w:r>
-              <w:rPr>
-                <w:rFonts w:ascii="Arial" w:hAnsi="Arial" w:eastAsia="微软雅黑"/>
-                <w:sz w:val="20"/>
-              </w:rPr>
-              <w:t>0.424</w:t>
-            </w:r>
-          </w:p>
-        </w:tc>
-        <w:tc>
-          <w:tcPr>
-            <w:tcW w:w="1881" w:type="dxa"/>
-            <w:shd w:val="clear" w:color="auto" w:fill="F0F4F8"/>
-          </w:tcPr>
-          <w:p>
-            <w:pPr>
-              <w:spacing w:line="240" w:lineRule="auto"/>
-            </w:pPr>
-            <w:r>
-              <w:rPr>
-                <w:rFonts w:ascii="Arial" w:hAnsi="Arial" w:eastAsia="微软雅黑"/>
-                <w:sz w:val="20"/>
-              </w:rPr>
-              <w:t>0.0000</w:t>
-            </w:r>
-          </w:p>
-        </w:tc>
-        <w:tc>
-          <w:tcPr>
-            <w:tcW w:w="1881" w:type="dxa"/>
-            <w:shd w:val="clear" w:color="auto" w:fill="F0F4F8"/>
+            <w:tcW w:w="1568" w:type="dxa"/>
+          </w:tcPr>
+          <w:p>
+            <w:pPr>
+              <w:spacing w:line="240" w:lineRule="auto"/>
+            </w:pPr>
+            <w:r>
+              <w:rPr>
+                <w:rFonts w:ascii="Arial" w:hAnsi="Arial" w:eastAsia="微软雅黑"/>
+                <w:sz w:val="20"/>
+              </w:rPr>
+              <w:t>MARA</w:t>
+            </w:r>
+          </w:p>
+        </w:tc>
+        <w:tc>
+          <w:tcPr>
+            <w:tcW w:w="1568" w:type="dxa"/>
+          </w:tcPr>
+          <w:p>
+            <w:pPr>
+              <w:spacing w:line="240" w:lineRule="auto"/>
+            </w:pPr>
+            <w:r>
+              <w:rPr>
+                <w:rFonts w:ascii="Arial" w:hAnsi="Arial" w:eastAsia="微软雅黑"/>
+                <w:sz w:val="20"/>
+              </w:rPr>
+              <w:t>BTC+SMH</w:t>
+            </w:r>
+          </w:p>
+        </w:tc>
+        <w:tc>
+          <w:tcPr>
+            <w:tcW w:w="1568" w:type="dxa"/>
+          </w:tcPr>
+          <w:p>
+            <w:pPr>
+              <w:spacing w:line="240" w:lineRule="auto"/>
+            </w:pPr>
+            <w:r>
+              <w:rPr>
+                <w:rFonts w:ascii="Arial" w:hAnsi="Arial" w:eastAsia="微软雅黑"/>
+                <w:sz w:val="20"/>
+              </w:rPr>
+              <w:t>0.421</w:t>
+            </w:r>
+          </w:p>
+        </w:tc>
+        <w:tc>
+          <w:tcPr>
+            <w:tcW w:w="1568" w:type="dxa"/>
+          </w:tcPr>
+          <w:p>
+            <w:pPr>
+              <w:spacing w:line="240" w:lineRule="auto"/>
+            </w:pPr>
+            <w:r>
+              <w:rPr>
+                <w:rFonts w:ascii="Arial" w:hAnsi="Arial" w:eastAsia="微软雅黑"/>
+                <w:sz w:val="20"/>
+              </w:rPr>
+              <w:t>0.00e+00</w:t>
+            </w:r>
+          </w:p>
+        </w:tc>
+        <w:tc>
+          <w:tcPr>
+            <w:tcW w:w="1568" w:type="dxa"/>
+          </w:tcPr>
+          <w:p>
+            <w:pPr>
+              <w:spacing w:line="240" w:lineRule="auto"/>
+            </w:pPr>
+            <w:r>
+              <w:rPr>
+                <w:rFonts w:ascii="Arial" w:hAnsi="Arial" w:eastAsia="微软雅黑"/>
+                <w:sz w:val="20"/>
+              </w:rPr>
+              <w:t>0.5396</w:t>
+            </w:r>
+          </w:p>
+        </w:tc>
+        <w:tc>
+          <w:tcPr>
+            <w:tcW w:w="1568" w:type="dxa"/>
           </w:tcPr>
           <w:p>
             <w:pPr>
@@ -6440,24 +6951,26 @@
         </w:trPr>
         <w:tc>
           <w:tcPr>
-            <w:tcW w:w="1881" w:type="dxa"/>
-          </w:tcPr>
-          <w:p>
-            <w:pPr>
-              <w:spacing w:line="240" w:lineRule="auto"/>
-            </w:pPr>
-            <w:r>
-              <w:rPr>
-                <w:rFonts w:ascii="Arial" w:hAnsi="Arial" w:eastAsia="微软雅黑"/>
-                <w:sz w:val="20"/>
-              </w:rPr>
-              <w:t>MARA</w:t>
-            </w:r>
-          </w:p>
-        </w:tc>
-        <w:tc>
-          <w:tcPr>
-            <w:tcW w:w="1881" w:type="dxa"/>
+            <w:tcW w:w="1568" w:type="dxa"/>
+            <w:shd w:val="clear" w:color="auto" w:fill="F0F4F8"/>
+          </w:tcPr>
+          <w:p>
+            <w:pPr>
+              <w:spacing w:line="240" w:lineRule="auto"/>
+            </w:pPr>
+            <w:r>
+              <w:rPr>
+                <w:rFonts w:ascii="Arial" w:hAnsi="Arial" w:eastAsia="微软雅黑"/>
+                <w:sz w:val="20"/>
+              </w:rPr>
+              <w:t>RIOT</w:t>
+            </w:r>
+          </w:p>
+        </w:tc>
+        <w:tc>
+          <w:tcPr>
+            <w:tcW w:w="1568" w:type="dxa"/>
+            <w:shd w:val="clear" w:color="auto" w:fill="F0F4F8"/>
           </w:tcPr>
           <w:p>
             <w:pPr>
@@ -6474,41 +6987,62 @@
         </w:tc>
         <w:tc>
           <w:tcPr>
-            <w:tcW w:w="1881" w:type="dxa"/>
-          </w:tcPr>
-          <w:p>
-            <w:pPr>
-              <w:spacing w:line="240" w:lineRule="auto"/>
-            </w:pPr>
-            <w:r>
-              <w:rPr>
-                <w:rFonts w:ascii="Arial" w:hAnsi="Arial" w:eastAsia="微软雅黑"/>
-                <w:sz w:val="20"/>
-              </w:rPr>
-              <w:t>0.421</w:t>
-            </w:r>
-          </w:p>
-        </w:tc>
-        <w:tc>
-          <w:tcPr>
-            <w:tcW w:w="1881" w:type="dxa"/>
-          </w:tcPr>
-          <w:p>
-            <w:pPr>
-              <w:spacing w:line="240" w:lineRule="auto"/>
-            </w:pPr>
-            <w:r>
-              <w:rPr>
-                <w:rFonts w:ascii="Arial" w:hAnsi="Arial" w:eastAsia="微软雅黑"/>
-                <w:sz w:val="20"/>
-              </w:rPr>
-              <w:t>0.0000</w:t>
-            </w:r>
-          </w:p>
-        </w:tc>
-        <w:tc>
-          <w:tcPr>
-            <w:tcW w:w="1881" w:type="dxa"/>
+            <w:tcW w:w="1568" w:type="dxa"/>
+            <w:shd w:val="clear" w:color="auto" w:fill="F0F4F8"/>
+          </w:tcPr>
+          <w:p>
+            <w:pPr>
+              <w:spacing w:line="240" w:lineRule="auto"/>
+            </w:pPr>
+            <w:r>
+              <w:rPr>
+                <w:rFonts w:ascii="Arial" w:hAnsi="Arial" w:eastAsia="微软雅黑"/>
+                <w:sz w:val="20"/>
+              </w:rPr>
+              <w:t>0.414</w:t>
+            </w:r>
+          </w:p>
+        </w:tc>
+        <w:tc>
+          <w:tcPr>
+            <w:tcW w:w="1568" w:type="dxa"/>
+            <w:shd w:val="clear" w:color="auto" w:fill="F0F4F8"/>
+          </w:tcPr>
+          <w:p>
+            <w:pPr>
+              <w:spacing w:line="240" w:lineRule="auto"/>
+            </w:pPr>
+            <w:r>
+              <w:rPr>
+                <w:rFonts w:ascii="Arial" w:hAnsi="Arial" w:eastAsia="微软雅黑"/>
+                <w:sz w:val="20"/>
+              </w:rPr>
+              <w:t>1.85e-28</w:t>
+            </w:r>
+          </w:p>
+        </w:tc>
+        <w:tc>
+          <w:tcPr>
+            <w:tcW w:w="1568" w:type="dxa"/>
+            <w:shd w:val="clear" w:color="auto" w:fill="F0F4F8"/>
+          </w:tcPr>
+          <w:p>
+            <w:pPr>
+              <w:spacing w:line="240" w:lineRule="auto"/>
+            </w:pPr>
+            <w:r>
+              <w:rPr>
+                <w:rFonts w:ascii="Arial" w:hAnsi="Arial" w:eastAsia="微软雅黑"/>
+                <w:sz w:val="20"/>
+              </w:rPr>
+              <w:t>0.7160</w:t>
+            </w:r>
+          </w:p>
+        </w:tc>
+        <w:tc>
+          <w:tcPr>
+            <w:tcW w:w="1568" w:type="dxa"/>
+            <w:shd w:val="clear" w:color="auto" w:fill="F0F4F8"/>
           </w:tcPr>
           <w:p>
             <w:pPr>
@@ -6546,26 +7080,24 @@
         </w:trPr>
         <w:tc>
           <w:tcPr>
-            <w:tcW w:w="1881" w:type="dxa"/>
-            <w:shd w:val="clear" w:color="auto" w:fill="F0F4F8"/>
-          </w:tcPr>
-          <w:p>
-            <w:pPr>
-              <w:spacing w:line="240" w:lineRule="auto"/>
-            </w:pPr>
-            <w:r>
-              <w:rPr>
-                <w:rFonts w:ascii="Arial" w:hAnsi="Arial" w:eastAsia="微软雅黑"/>
-                <w:sz w:val="20"/>
-              </w:rPr>
-              <w:t>RIOT</w:t>
-            </w:r>
-          </w:p>
-        </w:tc>
-        <w:tc>
-          <w:tcPr>
-            <w:tcW w:w="1881" w:type="dxa"/>
-            <w:shd w:val="clear" w:color="auto" w:fill="F0F4F8"/>
+            <w:tcW w:w="1568" w:type="dxa"/>
+          </w:tcPr>
+          <w:p>
+            <w:pPr>
+              <w:spacing w:line="240" w:lineRule="auto"/>
+            </w:pPr>
+            <w:r>
+              <w:rPr>
+                <w:rFonts w:ascii="Arial" w:hAnsi="Arial" w:eastAsia="微软雅黑"/>
+                <w:sz w:val="20"/>
+              </w:rPr>
+              <w:t>CLSK</w:t>
+            </w:r>
+          </w:p>
+        </w:tc>
+        <w:tc>
+          <w:tcPr>
+            <w:tcW w:w="1568" w:type="dxa"/>
           </w:tcPr>
           <w:p>
             <w:pPr>
@@ -6582,44 +7114,58 @@
         </w:tc>
         <w:tc>
           <w:tcPr>
-            <w:tcW w:w="1881" w:type="dxa"/>
-            <w:shd w:val="clear" w:color="auto" w:fill="F0F4F8"/>
-          </w:tcPr>
-          <w:p>
-            <w:pPr>
-              <w:spacing w:line="240" w:lineRule="auto"/>
-            </w:pPr>
-            <w:r>
-              <w:rPr>
-                <w:rFonts w:ascii="Arial" w:hAnsi="Arial" w:eastAsia="微软雅黑"/>
-                <w:sz w:val="20"/>
-              </w:rPr>
-              <w:t>0.414</w:t>
-            </w:r>
-          </w:p>
-        </w:tc>
-        <w:tc>
-          <w:tcPr>
-            <w:tcW w:w="1881" w:type="dxa"/>
-            <w:shd w:val="clear" w:color="auto" w:fill="F0F4F8"/>
-          </w:tcPr>
-          <w:p>
-            <w:pPr>
-              <w:spacing w:line="240" w:lineRule="auto"/>
-            </w:pPr>
-            <w:r>
-              <w:rPr>
-                <w:rFonts w:ascii="Arial" w:hAnsi="Arial" w:eastAsia="微软雅黑"/>
-                <w:sz w:val="20"/>
-              </w:rPr>
-              <w:t>0.0000</w:t>
-            </w:r>
-          </w:p>
-        </w:tc>
-        <w:tc>
-          <w:tcPr>
-            <w:tcW w:w="1881" w:type="dxa"/>
-            <w:shd w:val="clear" w:color="auto" w:fill="F0F4F8"/>
+            <w:tcW w:w="1568" w:type="dxa"/>
+          </w:tcPr>
+          <w:p>
+            <w:pPr>
+              <w:spacing w:line="240" w:lineRule="auto"/>
+            </w:pPr>
+            <w:r>
+              <w:rPr>
+                <w:rFonts w:ascii="Arial" w:hAnsi="Arial" w:eastAsia="微软雅黑"/>
+                <w:sz w:val="20"/>
+              </w:rPr>
+              <w:t>0.385</w:t>
+            </w:r>
+          </w:p>
+        </w:tc>
+        <w:tc>
+          <w:tcPr>
+            <w:tcW w:w="1568" w:type="dxa"/>
+          </w:tcPr>
+          <w:p>
+            <w:pPr>
+              <w:spacing w:line="240" w:lineRule="auto"/>
+            </w:pPr>
+            <w:r>
+              <w:rPr>
+                <w:rFonts w:ascii="Arial" w:hAnsi="Arial" w:eastAsia="微软雅黑"/>
+                <w:sz w:val="20"/>
+              </w:rPr>
+              <w:t>8.37e-27</w:t>
+            </w:r>
+          </w:p>
+        </w:tc>
+        <w:tc>
+          <w:tcPr>
+            <w:tcW w:w="1568" w:type="dxa"/>
+          </w:tcPr>
+          <w:p>
+            <w:pPr>
+              <w:spacing w:line="240" w:lineRule="auto"/>
+            </w:pPr>
+            <w:r>
+              <w:rPr>
+                <w:rFonts w:ascii="Arial" w:hAnsi="Arial" w:eastAsia="微软雅黑"/>
+                <w:sz w:val="20"/>
+              </w:rPr>
+              <w:t>0.2335</w:t>
+            </w:r>
+          </w:p>
+        </w:tc>
+        <w:tc>
+          <w:tcPr>
+            <w:tcW w:w="1568" w:type="dxa"/>
           </w:tcPr>
           <w:p>
             <w:pPr>
@@ -6657,113 +7203,7 @@
         </w:trPr>
         <w:tc>
           <w:tcPr>
-            <w:tcW w:w="1881" w:type="dxa"/>
-          </w:tcPr>
-          <w:p>
-            <w:pPr>
-              <w:spacing w:line="240" w:lineRule="auto"/>
-            </w:pPr>
-            <w:r>
-              <w:rPr>
-                <w:rFonts w:ascii="Arial" w:hAnsi="Arial" w:eastAsia="微软雅黑"/>
-                <w:sz w:val="20"/>
-              </w:rPr>
-              <w:t>CLSK</w:t>
-            </w:r>
-          </w:p>
-        </w:tc>
-        <w:tc>
-          <w:tcPr>
-            <w:tcW w:w="1881" w:type="dxa"/>
-          </w:tcPr>
-          <w:p>
-            <w:pPr>
-              <w:spacing w:line="240" w:lineRule="auto"/>
-            </w:pPr>
-            <w:r>
-              <w:rPr>
-                <w:rFonts w:ascii="Arial" w:hAnsi="Arial" w:eastAsia="微软雅黑"/>
-                <w:sz w:val="20"/>
-              </w:rPr>
-              <w:t>BTC+SMH</w:t>
-            </w:r>
-          </w:p>
-        </w:tc>
-        <w:tc>
-          <w:tcPr>
-            <w:tcW w:w="1881" w:type="dxa"/>
-          </w:tcPr>
-          <w:p>
-            <w:pPr>
-              <w:spacing w:line="240" w:lineRule="auto"/>
-            </w:pPr>
-            <w:r>
-              <w:rPr>
-                <w:rFonts w:ascii="Arial" w:hAnsi="Arial" w:eastAsia="微软雅黑"/>
-                <w:sz w:val="20"/>
-              </w:rPr>
-              <w:t>0.385</w:t>
-            </w:r>
-          </w:p>
-        </w:tc>
-        <w:tc>
-          <w:tcPr>
-            <w:tcW w:w="1881" w:type="dxa"/>
-          </w:tcPr>
-          <w:p>
-            <w:pPr>
-              <w:spacing w:line="240" w:lineRule="auto"/>
-            </w:pPr>
-            <w:r>
-              <w:rPr>
-                <w:rFonts w:ascii="Arial" w:hAnsi="Arial" w:eastAsia="微软雅黑"/>
-                <w:sz w:val="20"/>
-              </w:rPr>
-              <w:t>0.0000</w:t>
-            </w:r>
-          </w:p>
-        </w:tc>
-        <w:tc>
-          <w:tcPr>
-            <w:tcW w:w="1881" w:type="dxa"/>
-          </w:tcPr>
-          <w:p>
-            <w:pPr>
-              <w:spacing w:line="240" w:lineRule="auto"/>
-            </w:pPr>
-            <w:r>
-              <w:rPr>
-                <w:rFonts w:ascii="Arial" w:hAnsi="Arial" w:eastAsia="微软雅黑"/>
-                <w:sz w:val="20"/>
-              </w:rPr>
-              <w:t>否</w:t>
-            </w:r>
-          </w:p>
-        </w:tc>
-      </w:tr>
-      <w:tr>
-        <w:tblPrEx>
-          <w:tblBorders>
-            <w:top w:val="single" w:color="auto" w:sz="4" w:space="0"/>
-            <w:left w:val="single" w:color="auto" w:sz="4" w:space="0"/>
-            <w:bottom w:val="single" w:color="auto" w:sz="4" w:space="0"/>
-            <w:right w:val="single" w:color="auto" w:sz="4" w:space="0"/>
-            <w:insideH w:val="single" w:color="auto" w:sz="4" w:space="0"/>
-            <w:insideV w:val="single" w:color="auto" w:sz="4" w:space="0"/>
-          </w:tblBorders>
-          <w:tblCellMar>
-            <w:top w:w="0" w:type="dxa"/>
-            <w:left w:w="108" w:type="dxa"/>
-            <w:bottom w:w="0" w:type="dxa"/>
-            <w:right w:w="108" w:type="dxa"/>
-          </w:tblCellMar>
-        </w:tblPrEx>
-        <w:trPr>
-          <w:jc w:val="center"/>
-        </w:trPr>
-        <w:tc>
-          <w:tcPr>
-            <w:tcW w:w="1881" w:type="dxa"/>
+            <w:tcW w:w="1568" w:type="dxa"/>
             <w:shd w:val="clear" w:color="auto" w:fill="F0F4F8"/>
           </w:tcPr>
           <w:p>
@@ -6781,7 +7221,7 @@
         </w:tc>
         <w:tc>
           <w:tcPr>
-            <w:tcW w:w="1881" w:type="dxa"/>
+            <w:tcW w:w="1568" w:type="dxa"/>
             <w:shd w:val="clear" w:color="auto" w:fill="F0F4F8"/>
           </w:tcPr>
           <w:p>
@@ -6799,7 +7239,7 @@
         </w:tc>
         <w:tc>
           <w:tcPr>
-            <w:tcW w:w="1881" w:type="dxa"/>
+            <w:tcW w:w="1568" w:type="dxa"/>
             <w:shd w:val="clear" w:color="auto" w:fill="F0F4F8"/>
           </w:tcPr>
           <w:p>
@@ -6817,7 +7257,7 @@
         </w:tc>
         <w:tc>
           <w:tcPr>
-            <w:tcW w:w="1881" w:type="dxa"/>
+            <w:tcW w:w="1568" w:type="dxa"/>
             <w:shd w:val="clear" w:color="auto" w:fill="F0F4F8"/>
           </w:tcPr>
           <w:p>
@@ -6829,13 +7269,31 @@
                 <w:rFonts w:ascii="Arial" w:hAnsi="Arial" w:eastAsia="微软雅黑"/>
                 <w:sz w:val="20"/>
               </w:rPr>
-              <w:t>0.0000</w:t>
-            </w:r>
-          </w:p>
-        </w:tc>
-        <w:tc>
-          <w:tcPr>
-            <w:tcW w:w="1881" w:type="dxa"/>
+              <w:t>0.00e+00</w:t>
+            </w:r>
+          </w:p>
+        </w:tc>
+        <w:tc>
+          <w:tcPr>
+            <w:tcW w:w="1568" w:type="dxa"/>
+            <w:shd w:val="clear" w:color="auto" w:fill="F0F4F8"/>
+          </w:tcPr>
+          <w:p>
+            <w:pPr>
+              <w:spacing w:line="240" w:lineRule="auto"/>
+            </w:pPr>
+            <w:r>
+              <w:rPr>
+                <w:rFonts w:ascii="Arial" w:hAnsi="Arial" w:eastAsia="微软雅黑"/>
+                <w:sz w:val="20"/>
+              </w:rPr>
+              <w:t>0.2178</w:t>
+            </w:r>
+          </w:p>
+        </w:tc>
+        <w:tc>
+          <w:tcPr>
+            <w:tcW w:w="1568" w:type="dxa"/>
             <w:shd w:val="clear" w:color="auto" w:fill="F0F4F8"/>
           </w:tcPr>
           <w:p>
@@ -9322,7 +9780,75 @@
           <w:b w:val="0"/>
           <w:sz w:val="22"/>
         </w:rPr>
-        <w:t>R²中位数0.535，15/25个资产R²≥0.5。ADF检验全部通过（p&lt;0.05），残差序列均为平稳。Ljung-Box检验60%资产存在自相关，其中负自相关资产（如ARB、MSTR）残差回归速度更快，更适合本策略。Ridge vs OLS对比验证：Ridge的β时序平滑度显著优于OLS，且R²无显著下降（&lt;0.01）。</w:t>
+        <w:t>R²中位数0.535，15/25个资产R²≥0.5。本报告对残差平稳性进行双重ADF检验：</w:t>
+      </w:r>
+    </w:p>
+    <w:p>
+      <w:pPr>
+        <w:spacing w:before="40" w:after="40"/>
+      </w:pPr>
+      <w:r>
+        <w:rPr>
+          <w:rFonts w:ascii="Arial" w:hAnsi="Arial" w:eastAsia="微软雅黑"/>
+          <w:b w:val="0"/>
+          <w:color w:val="667788"/>
+          <w:sz w:val="20"/>
+        </w:rPr>
+        <w:t>(1) 日频残差ADF：全部通过（p&lt;0.05），残差围绕零波动，无单位根。但这是必要非充分条件——日频收益率天然均值回归，ADF必然通过，无区分力。</w:t>
+      </w:r>
+    </w:p>
+    <w:p>
+      <w:pPr>
+        <w:spacing w:before="40" w:after="40"/>
+      </w:pPr>
+      <w:r>
+        <w:rPr>
+          <w:rFonts w:ascii="Arial" w:hAnsi="Arial" w:eastAsia="微软雅黑"/>
+          <w:b w:val="0"/>
+          <w:color w:val="667788"/>
+          <w:sz w:val="20"/>
+        </w:rPr>
+        <w:t>(2) 累积残差ADF：多数未通过（p&gt;0.05），表明资产与因子之间不存在严格协整关系，价差具有随机游走特征。累积残差检验的是价差是否均值回归，即配对之间是否存在长期均衡关系，这是统计套利中ADF检验的标准用法。</w:t>
+      </w:r>
+    </w:p>
+    <w:p>
+      <w:pPr>
+        <w:spacing w:before="40" w:after="40"/>
+      </w:pPr>
+      <w:r>
+        <w:rPr>
+          <w:rFonts w:ascii="Arial" w:hAnsi="Arial" w:eastAsia="微软雅黑"/>
+          <w:b w:val="0"/>
+          <w:sz w:val="22"/>
+        </w:rPr>
+        <w:t>结论：日频残差平稳是必要条件但非充分条件，累积残差不平稳说明配对间缺乏协整基础，这是策略日频回测亏钱的深层结构性原因。</w:t>
+      </w:r>
+    </w:p>
+    <w:p>
+      <w:pPr>
+        <w:spacing w:before="40" w:after="40"/>
+      </w:pPr>
+      <w:r>
+        <w:rPr>
+          <w:rFonts w:ascii="Arial" w:hAnsi="Arial" w:eastAsia="微软雅黑"/>
+          <w:b w:val="0"/>
+          <w:color w:val="667788"/>
+          <w:sz w:val="20"/>
+        </w:rPr>
+        <w:t>经济学解释：累积残差不通过并非统计意外，而是符合经济直觉。加密资产（如SOL、ARB、DOGE）本质上是投机性标的，不存在内在的均衡估值水平——价格由市场情绪和资金流驱动，而非经济基本面锚定。用BTC+ETH去'解释'这些资产的涨跌，假设的是一种不存在的长期均衡关系。真正可能存在协整的配对应当具备经济绑定：如MSTR持有BTC的资产净值托底、COIN收入与市场活跃度的业务关联、NVDA与SMH的产业链上下游关系。本回测中25个配对仅UNI和AMZN通过协整检验，也印证了这一点——AMZN作为消费龙头与QQQ+SMH有基本面联动，而多数加密资产缺乏此类经济锚定。</w:t>
+      </w:r>
+    </w:p>
+    <w:p>
+      <w:pPr>
+        <w:spacing w:before="40" w:after="40"/>
+      </w:pPr>
+      <w:r>
+        <w:rPr>
+          <w:rFonts w:ascii="Arial" w:hAnsi="Arial" w:eastAsia="微软雅黑"/>
+          <w:b w:val="0"/>
+          <w:sz w:val="22"/>
+        </w:rPr>
+        <w:t>Ljung-Box检验（日频残差自相关）60%资产存在显著自相关，负自相关资产（如ARB、MSTR）的残差回归速度更快。Ridge vs OLS对比验证：Ridge的β时序平滑度显著优于OLS，且R²无显著下降（&lt;0.01）。</w:t>
       </w:r>
     </w:p>
     <w:p>
@@ -9395,8 +9921,8 @@
       <w:r>
         <w:drawing>
           <wp:inline distT="0" distB="0" distL="114300" distR="114300">
-            <wp:extent cx="5399405" cy="3836670"/>
-            <wp:effectExtent l="0" t="0" r="10795" b="11430"/>
+            <wp:extent cx="6372860" cy="4528820"/>
+            <wp:effectExtent l="0" t="0" r="2540" b="5080"/>
             <wp:docPr id="1" name="Picture 1"/>
             <wp:cNvGraphicFramePr>
               <a:graphicFrameLocks xmlns:a="http://schemas.openxmlformats.org/drawingml/2006/main" noChangeAspect="1"/>
@@ -9419,7 +9945,7 @@
                   <pic:spPr>
                     <a:xfrm>
                       <a:off x="0" y="0"/>
-                      <a:ext cx="5400000" cy="3836774"/>
+                      <a:ext cx="6372860" cy="4528820"/>
                     </a:xfrm>
                     <a:prstGeom prst="rect">
                       <a:avLst/>
@@ -9454,8 +9980,8 @@
       <w:r>
         <w:drawing>
           <wp:inline distT="0" distB="0" distL="114300" distR="114300">
-            <wp:extent cx="5399405" cy="3836670"/>
-            <wp:effectExtent l="0" t="0" r="10795" b="11430"/>
+            <wp:extent cx="5533390" cy="3932555"/>
+            <wp:effectExtent l="0" t="0" r="3810" b="4445"/>
             <wp:docPr id="2" name="Picture 2"/>
             <wp:cNvGraphicFramePr>
               <a:graphicFrameLocks xmlns:a="http://schemas.openxmlformats.org/drawingml/2006/main" noChangeAspect="1"/>
@@ -9478,7 +10004,7 @@
                   <pic:spPr>
                     <a:xfrm>
                       <a:off x="0" y="0"/>
-                      <a:ext cx="5400000" cy="3836774"/>
+                      <a:ext cx="5533390" cy="3932555"/>
                     </a:xfrm>
                     <a:prstGeom prst="rect">
                       <a:avLst/>
@@ -9514,7 +10040,7 @@
         <w:drawing>
           <wp:inline distT="0" distB="0" distL="114300" distR="114300">
             <wp:extent cx="5399405" cy="3814445"/>
-            <wp:effectExtent l="0" t="0" r="10795" b="14605"/>
+            <wp:effectExtent l="0" t="0" r="10795" b="8255"/>
             <wp:docPr id="3" name="Picture 3"/>
             <wp:cNvGraphicFramePr>
               <a:graphicFrameLocks xmlns:a="http://schemas.openxmlformats.org/drawingml/2006/main" noChangeAspect="1"/>
@@ -9550,11 +10076,7 @@
         </w:drawing>
       </w:r>
     </w:p>
-    <w:p>
-      <w:r>
-        <w:br w:type="page"/>
-      </w:r>
-    </w:p>
+    <w:p/>
     <w:p>
       <w:pPr>
         <w:pStyle w:val="3"/>
@@ -10098,8 +10620,8 @@
       <w:r>
         <w:drawing>
           <wp:inline distT="0" distB="0" distL="114300" distR="114300">
-            <wp:extent cx="5039995" cy="2502535"/>
-            <wp:effectExtent l="0" t="0" r="8255" b="12065"/>
+            <wp:extent cx="6068060" cy="3013075"/>
+            <wp:effectExtent l="0" t="0" r="2540" b="9525"/>
             <wp:docPr id="4" name="Picture 4"/>
             <wp:cNvGraphicFramePr>
               <a:graphicFrameLocks xmlns:a="http://schemas.openxmlformats.org/drawingml/2006/main" noChangeAspect="1"/>
@@ -10122,7 +10644,7 @@
                   <pic:spPr>
                     <a:xfrm>
                       <a:off x="0" y="0"/>
-                      <a:ext cx="5040000" cy="2503087"/>
+                      <a:ext cx="6068060" cy="3013075"/>
                     </a:xfrm>
                     <a:prstGeom prst="rect">
                       <a:avLst/>
@@ -10157,8 +10679,8 @@
       <w:r>
         <w:drawing>
           <wp:inline distT="0" distB="0" distL="114300" distR="114300">
-            <wp:extent cx="5039995" cy="2502535"/>
-            <wp:effectExtent l="0" t="0" r="8255" b="12065"/>
+            <wp:extent cx="6103620" cy="3030855"/>
+            <wp:effectExtent l="0" t="0" r="5080" b="4445"/>
             <wp:docPr id="5" name="Picture 5"/>
             <wp:cNvGraphicFramePr>
               <a:graphicFrameLocks xmlns:a="http://schemas.openxmlformats.org/drawingml/2006/main" noChangeAspect="1"/>
@@ -10181,7 +10703,7 @@
                   <pic:spPr>
                     <a:xfrm>
                       <a:off x="0" y="0"/>
-                      <a:ext cx="5040000" cy="2503087"/>
+                      <a:ext cx="6103620" cy="3030855"/>
                     </a:xfrm>
                     <a:prstGeom prst="rect">
                       <a:avLst/>
@@ -10216,8 +10738,8 @@
       <w:r>
         <w:drawing>
           <wp:inline distT="0" distB="0" distL="114300" distR="114300">
-            <wp:extent cx="5039995" cy="2502535"/>
-            <wp:effectExtent l="0" t="0" r="8255" b="12065"/>
+            <wp:extent cx="6323965" cy="3140710"/>
+            <wp:effectExtent l="0" t="0" r="635" b="8890"/>
             <wp:docPr id="6" name="Picture 6"/>
             <wp:cNvGraphicFramePr>
               <a:graphicFrameLocks xmlns:a="http://schemas.openxmlformats.org/drawingml/2006/main" noChangeAspect="1"/>
@@ -10240,7 +10762,7 @@
                   <pic:spPr>
                     <a:xfrm>
                       <a:off x="0" y="0"/>
-                      <a:ext cx="5040000" cy="2503087"/>
+                      <a:ext cx="6323965" cy="3140710"/>
                     </a:xfrm>
                     <a:prstGeom prst="rect">
                       <a:avLst/>
@@ -10253,7 +10775,11 @@
         </w:drawing>
       </w:r>
     </w:p>
-    <w:p/>
+    <w:p>
+      <w:r>
+        <w:br w:type="page"/>
+      </w:r>
+    </w:p>
     <w:p>
       <w:pPr>
         <w:pStyle w:val="3"/>
@@ -10856,8 +11382,8 @@
       <w:r>
         <w:drawing>
           <wp:inline distT="0" distB="0" distL="114300" distR="114300">
-            <wp:extent cx="6252845" cy="2203450"/>
-            <wp:effectExtent l="0" t="0" r="14605" b="6350"/>
+            <wp:extent cx="6569075" cy="2314575"/>
+            <wp:effectExtent l="0" t="0" r="9525" b="9525"/>
             <wp:docPr id="7" name="Picture 7"/>
             <wp:cNvGraphicFramePr>
               <a:graphicFrameLocks xmlns:a="http://schemas.openxmlformats.org/drawingml/2006/main" noChangeAspect="1"/>
@@ -10880,7 +11406,7 @@
                   <pic:spPr>
                     <a:xfrm>
                       <a:off x="0" y="0"/>
-                      <a:ext cx="6252845" cy="2203450"/>
+                      <a:ext cx="6569075" cy="2314575"/>
                     </a:xfrm>
                     <a:prstGeom prst="rect">
                       <a:avLst/>
@@ -10915,8 +11441,8 @@
       <w:r>
         <w:drawing>
           <wp:inline distT="0" distB="0" distL="114300" distR="114300">
-            <wp:extent cx="6209665" cy="2188210"/>
-            <wp:effectExtent l="0" t="0" r="635" b="2540"/>
+            <wp:extent cx="6566535" cy="2313940"/>
+            <wp:effectExtent l="0" t="0" r="12065" b="10160"/>
             <wp:docPr id="8" name="Picture 8"/>
             <wp:cNvGraphicFramePr>
               <a:graphicFrameLocks xmlns:a="http://schemas.openxmlformats.org/drawingml/2006/main" noChangeAspect="1"/>
@@ -10939,7 +11465,7 @@
                   <pic:spPr>
                     <a:xfrm>
                       <a:off x="0" y="0"/>
-                      <a:ext cx="6209665" cy="2188210"/>
+                      <a:ext cx="6566535" cy="2313940"/>
                     </a:xfrm>
                     <a:prstGeom prst="rect">
                       <a:avLst/>
@@ -10974,8 +11500,8 @@
       <w:r>
         <w:drawing>
           <wp:inline distT="0" distB="0" distL="114300" distR="114300">
-            <wp:extent cx="6436360" cy="2266315"/>
-            <wp:effectExtent l="0" t="0" r="2540" b="635"/>
+            <wp:extent cx="6825615" cy="2404110"/>
+            <wp:effectExtent l="0" t="0" r="6985" b="8890"/>
             <wp:docPr id="9" name="Picture 9"/>
             <wp:cNvGraphicFramePr>
               <a:graphicFrameLocks xmlns:a="http://schemas.openxmlformats.org/drawingml/2006/main" noChangeAspect="1"/>
@@ -10998,7 +11524,7 @@
                   <pic:spPr>
                     <a:xfrm>
                       <a:off x="0" y="0"/>
-                      <a:ext cx="6436360" cy="2266315"/>
+                      <a:ext cx="6825615" cy="2404110"/>
                     </a:xfrm>
                     <a:prstGeom prst="rect">
                       <a:avLst/>
@@ -11741,12 +12267,11 @@
       <w:pPr>
         <w:jc w:val="center"/>
       </w:pPr>
-      <w:bookmarkStart w:id="0" w:name="_GoBack"/>
       <w:r>
         <w:drawing>
           <wp:inline distT="0" distB="0" distL="114300" distR="114300">
-            <wp:extent cx="5920105" cy="3359785"/>
-            <wp:effectExtent l="0" t="0" r="4445" b="12065"/>
+            <wp:extent cx="5664200" cy="3214370"/>
+            <wp:effectExtent l="0" t="0" r="0" b="11430"/>
             <wp:docPr id="10" name="Picture 10"/>
             <wp:cNvGraphicFramePr>
               <a:graphicFrameLocks xmlns:a="http://schemas.openxmlformats.org/drawingml/2006/main" noChangeAspect="1"/>
@@ -11769,7 +12294,7 @@
                   <pic:spPr>
                     <a:xfrm>
                       <a:off x="0" y="0"/>
-                      <a:ext cx="5920105" cy="3359785"/>
+                      <a:ext cx="5664200" cy="3214370"/>
                     </a:xfrm>
                     <a:prstGeom prst="rect">
                       <a:avLst/>
@@ -11781,7 +12306,6 @@
           </wp:inline>
         </w:drawing>
       </w:r>
-      <w:bookmarkEnd w:id="0"/>
     </w:p>
     <w:p>
       <w:pPr>
@@ -13603,6 +14127,12 @@
             <w:insideH w:val="single" w:color="auto" w:sz="4" w:space="0"/>
             <w:insideV w:val="single" w:color="auto" w:sz="4" w:space="0"/>
           </w:tblBorders>
+          <w:tblCellMar>
+            <w:top w:w="0" w:type="dxa"/>
+            <w:left w:w="108" w:type="dxa"/>
+            <w:bottom w:w="0" w:type="dxa"/>
+            <w:right w:w="108" w:type="dxa"/>
+          </w:tblCellMar>
         </w:tblPrEx>
         <w:trPr>
           <w:jc w:val="center"/>
@@ -15293,7 +15823,47 @@
           <w:b w:val="0"/>
           <w:sz w:val="22"/>
         </w:rPr>
-        <w:t>该策略不赚钱的原因不在于参数选择，而在于日频残差信号本身不具备足够的预测力。残差半衰期分析显示所有25个资产的残差半衰期均低于0.5天（0.1-0.4天），意味着回归发生在日内（4-8小时），而非日间。日频回测无法捕捉此类快速回归——持有期内残差始终为正（做空时），每日PnL持续亏损。</w:t>
+        <w:t>该策略不赚钱的原因分为两个层次：</w:t>
+      </w:r>
+    </w:p>
+    <w:p>
+      <w:pPr>
+        <w:spacing w:before="40" w:after="40"/>
+      </w:pPr>
+      <w:r>
+        <w:rPr>
+          <w:rFonts w:ascii="Arial" w:hAnsi="Arial" w:eastAsia="微软雅黑"/>
+          <w:b w:val="0"/>
+          <w:sz w:val="22"/>
+        </w:rPr>
+        <w:t>表层原因——频率不匹配：残差半衰期分析显示所有25个资产的残差半衰期均低于0.5天（0.1-0.4天），回归发生在日内（4-8小时），而非日间。日频回测无法捕捉此类快速回归——持有期内残差始终为正（做空时），每日PnL持续亏损。</w:t>
+      </w:r>
+    </w:p>
+    <w:p>
+      <w:pPr>
+        <w:spacing w:before="40" w:after="40"/>
+      </w:pPr>
+      <w:r>
+        <w:rPr>
+          <w:rFonts w:ascii="Arial" w:hAnsi="Arial" w:eastAsia="微软雅黑"/>
+          <w:b w:val="0"/>
+          <w:sz w:val="22"/>
+        </w:rPr>
+        <w:t>深层原因——协整关系不成立：累积残差ADF检验结果显示，25个资产中仅2个（UNI p=0.017、AMZN p=0.023）通过协整检验，其余23个累积残差未通过平稳性检验（p&gt;0.05），表明目标资产与因子之间不存在严格协整关系。换言之，价差具有随机游走特征，不具备长期均值回归的统计基础。即使将数据频率提升至4小时，如果协整关系本身不成立，策略依然无法稳定盈利。正确的改进方向应首先通过Engle-Granger或Johansen协整检验筛选出真正存在协整关系的配对，再进行信号生成。</w:t>
+      </w:r>
+    </w:p>
+    <w:p>
+      <w:pPr>
+        <w:spacing w:before="40" w:after="40"/>
+      </w:pPr>
+      <w:r>
+        <w:rPr>
+          <w:rFonts w:ascii="Arial" w:hAnsi="Arial" w:eastAsia="微软雅黑"/>
+          <w:b w:val="0"/>
+          <w:color w:val="667788"/>
+          <w:sz w:val="20"/>
+        </w:rPr>
+        <w:t>实证验证：协整检验的预测力得到了回测结果的印证。AMZN（协整通过）8笔交易毛PnL +$24K、净PnL +$18K、胜率75%，是全部25个资产中表现最好的之一。UNI（协整通过但交易过于频繁）35笔交易毛PnL +$18K但被成本吞噬至净PnL -$49K。这表明协整检验是有效的筛选工具，但同时需要控制交易频率以避免成本侵蚀。</w:t>
       </w:r>
     </w:p>
     <w:p>
@@ -15320,7 +15890,7 @@
           <w:b w:val="0"/>
           <w:sz w:val="22"/>
         </w:rPr>
-        <w:t>首要改进：使用4小时K线替代日线，匹配残差的快速回归特性。已有14个加密资产的4小时数据。辅助改进：精选标的（仅交易ARB/MSFT/AMZN等正收益资产）、LASSO动态因子选择、maker挂单降费（费率降低50%+）。长期可持续性：Alpha来源是跨市场定价偏差，预计年衰减10-20%，需更高数据频率维持竞争力。</w:t>
+        <w:t>首要改进：以协整检验为前置筛选——仅对累积残差ADF通过的配对生成信号，预计可将标的池从25个缩减至2-5个高质量配对。次要改进：使用4小时K线替代日线，匹配残差的快速回归特性；精选标的（AMZN等协整+正收益资产）；LASSO动态因子选择；maker挂单降费（费率降低50%+）。长期可持续性：Alpha来源是跨市场定价偏差，预计年衰减10-20%，需更高数据频率维持竞争力。</w:t>
       </w:r>
     </w:p>
     <w:p>
@@ -15847,7 +16417,7 @@
           <w:b w:val="0"/>
           <w:sz w:val="22"/>
         </w:rPr>
-        <w:t>加分项已完成：Ridge回归处理共线性（vs OLS）、真实历史资金费率（Binance API）、极端事件滑点放大。加分项待完成：4小时数据（数据已下载，待运行完整pipeline）。</w:t>
+        <w:t>加分项已完成：Ridge回归处理共线性（vs OLS）、真实历史资金费率（Binance API）、极端事件滑点放大、累积残差ADF检验（协整验证）。加分项待完成：4小时数据（数据已下载，待运行完整pipeline）。</w:t>
       </w:r>
     </w:p>
     <w:p>
@@ -16666,6 +17236,12 @@
             <w:insideH w:val="single" w:color="auto" w:sz="4" w:space="0"/>
             <w:insideV w:val="single" w:color="auto" w:sz="4" w:space="0"/>
           </w:tblBorders>
+          <w:tblCellMar>
+            <w:top w:w="0" w:type="dxa"/>
+            <w:left w:w="108" w:type="dxa"/>
+            <w:bottom w:w="0" w:type="dxa"/>
+            <w:right w:w="108" w:type="dxa"/>
+          </w:tblCellMar>
         </w:tblPrEx>
         <w:trPr>
           <w:jc w:val="center"/>
@@ -17407,6 +17983,8 @@
         </w:rPr>
         <w:t>可视化图表: output/figures/ 目录下所有PNG文件</w:t>
       </w:r>
+      <w:bookmarkStart w:id="0" w:name="_GoBack"/>
+      <w:bookmarkEnd w:id="0"/>
     </w:p>
     <w:p>
       <w:pPr>
@@ -17686,30 +18264,30 @@
     <w:lsdException w:uiPriority="99" w:name="table of authorities"/>
     <w:lsdException w:uiPriority="99" w:semiHidden="0" w:name="macro"/>
     <w:lsdException w:uiPriority="99" w:name="toa heading"/>
-    <w:lsdException w:qFormat="1" w:uiPriority="99" w:semiHidden="0" w:name="List"/>
+    <w:lsdException w:uiPriority="99" w:semiHidden="0" w:name="List"/>
     <w:lsdException w:uiPriority="99" w:semiHidden="0" w:name="List Bullet"/>
-    <w:lsdException w:qFormat="1" w:uiPriority="99" w:semiHidden="0" w:name="List Number"/>
-    <w:lsdException w:qFormat="1" w:uiPriority="99" w:semiHidden="0" w:name="List 2"/>
-    <w:lsdException w:qFormat="1" w:uiPriority="99" w:semiHidden="0" w:name="List 3"/>
+    <w:lsdException w:uiPriority="99" w:semiHidden="0" w:name="List Number"/>
+    <w:lsdException w:uiPriority="99" w:semiHidden="0" w:name="List 2"/>
+    <w:lsdException w:uiPriority="99" w:semiHidden="0" w:name="List 3"/>
     <w:lsdException w:uiPriority="99" w:name="List 4"/>
     <w:lsdException w:uiPriority="99" w:name="List 5"/>
-    <w:lsdException w:qFormat="1" w:uiPriority="99" w:semiHidden="0" w:name="List Bullet 2"/>
+    <w:lsdException w:uiPriority="99" w:semiHidden="0" w:name="List Bullet 2"/>
     <w:lsdException w:uiPriority="99" w:semiHidden="0" w:name="List Bullet 3"/>
     <w:lsdException w:uiPriority="99" w:name="List Bullet 4"/>
     <w:lsdException w:uiPriority="99" w:name="List Bullet 5"/>
-    <w:lsdException w:qFormat="1" w:uiPriority="99" w:semiHidden="0" w:name="List Number 2"/>
-    <w:lsdException w:qFormat="1" w:uiPriority="99" w:semiHidden="0" w:name="List Number 3"/>
+    <w:lsdException w:uiPriority="99" w:semiHidden="0" w:name="List Number 2"/>
+    <w:lsdException w:uiPriority="99" w:semiHidden="0" w:name="List Number 3"/>
     <w:lsdException w:uiPriority="99" w:name="List Number 4"/>
     <w:lsdException w:uiPriority="99" w:name="List Number 5"/>
     <w:lsdException w:qFormat="1" w:unhideWhenUsed="0" w:uiPriority="10" w:semiHidden="0" w:name="Title"/>
     <w:lsdException w:uiPriority="99" w:name="Closing"/>
     <w:lsdException w:uiPriority="99" w:name="Signature"/>
-    <w:lsdException w:qFormat="1" w:uiPriority="1" w:name="Default Paragraph Font"/>
-    <w:lsdException w:qFormat="1" w:uiPriority="99" w:semiHidden="0" w:name="Body Text"/>
+    <w:lsdException w:uiPriority="1" w:name="Default Paragraph Font"/>
+    <w:lsdException w:uiPriority="99" w:semiHidden="0" w:name="Body Text"/>
     <w:lsdException w:uiPriority="99" w:name="Body Text Indent"/>
-    <w:lsdException w:qFormat="1" w:uiPriority="99" w:semiHidden="0" w:name="List Continue"/>
-    <w:lsdException w:qFormat="1" w:uiPriority="99" w:semiHidden="0" w:name="List Continue 2"/>
-    <w:lsdException w:qFormat="1" w:uiPriority="99" w:semiHidden="0" w:name="List Continue 3"/>
+    <w:lsdException w:uiPriority="99" w:semiHidden="0" w:name="List Continue"/>
+    <w:lsdException w:uiPriority="99" w:semiHidden="0" w:name="List Continue 2"/>
+    <w:lsdException w:uiPriority="99" w:semiHidden="0" w:name="List Continue 3"/>
     <w:lsdException w:uiPriority="99" w:name="List Continue 4"/>
     <w:lsdException w:uiPriority="99" w:name="List Continue 5"/>
     <w:lsdException w:uiPriority="99" w:name="Message Header"/>
@@ -17719,8 +18297,8 @@
     <w:lsdException w:uiPriority="99" w:name="Body Text First Indent"/>
     <w:lsdException w:uiPriority="99" w:name="Body Text First Indent 2"/>
     <w:lsdException w:uiPriority="99" w:name="Note Heading"/>
-    <w:lsdException w:qFormat="1" w:uiPriority="99" w:semiHidden="0" w:name="Body Text 2"/>
-    <w:lsdException w:qFormat="1" w:uiPriority="99" w:semiHidden="0" w:name="Body Text 3"/>
+    <w:lsdException w:uiPriority="99" w:semiHidden="0" w:name="Body Text 2"/>
+    <w:lsdException w:uiPriority="99" w:semiHidden="0" w:name="Body Text 3"/>
     <w:lsdException w:uiPriority="99" w:name="Body Text Indent 2"/>
     <w:lsdException w:uiPriority="99" w:name="Body Text Indent 3"/>
     <w:lsdException w:uiPriority="99" w:name="Block Text"/>
@@ -17787,44 +18365,44 @@
     <w:lsdException w:uiPriority="99" w:name="Table Web 2"/>
     <w:lsdException w:uiPriority="99" w:name="Table Web 3"/>
     <w:lsdException w:uiPriority="99" w:name="Balloon Text"/>
-    <w:lsdException w:qFormat="1" w:unhideWhenUsed="0" w:uiPriority="59" w:semiHidden="0" w:name="Table Grid"/>
+    <w:lsdException w:unhideWhenUsed="0" w:uiPriority="59" w:semiHidden="0" w:name="Table Grid"/>
     <w:lsdException w:uiPriority="99" w:name="Table Theme"/>
     <w:lsdException w:qFormat="1" w:unhideWhenUsed="0" w:uiPriority="1" w:semiHidden="0" w:name="No Spacing"/>
-    <w:lsdException w:qFormat="1" w:unhideWhenUsed="0" w:uiPriority="60" w:semiHidden="0" w:name="Light Shading"/>
-    <w:lsdException w:qFormat="1" w:unhideWhenUsed="0" w:uiPriority="61" w:semiHidden="0" w:name="Light List"/>
-    <w:lsdException w:qFormat="1" w:unhideWhenUsed="0" w:uiPriority="62" w:semiHidden="0" w:name="Light Grid"/>
-    <w:lsdException w:qFormat="1" w:unhideWhenUsed="0" w:uiPriority="63" w:semiHidden="0" w:name="Medium Shading 1"/>
+    <w:lsdException w:unhideWhenUsed="0" w:uiPriority="60" w:semiHidden="0" w:name="Light Shading"/>
+    <w:lsdException w:unhideWhenUsed="0" w:uiPriority="61" w:semiHidden="0" w:name="Light List"/>
+    <w:lsdException w:unhideWhenUsed="0" w:uiPriority="62" w:semiHidden="0" w:name="Light Grid"/>
+    <w:lsdException w:unhideWhenUsed="0" w:uiPriority="63" w:semiHidden="0" w:name="Medium Shading 1"/>
     <w:lsdException w:unhideWhenUsed="0" w:uiPriority="64" w:semiHidden="0" w:name="Medium Shading 2"/>
     <w:lsdException w:unhideWhenUsed="0" w:uiPriority="65" w:semiHidden="0" w:name="Medium List 1"/>
     <w:lsdException w:unhideWhenUsed="0" w:uiPriority="66" w:semiHidden="0" w:name="Medium List 2"/>
-    <w:lsdException w:qFormat="1" w:unhideWhenUsed="0" w:uiPriority="67" w:semiHidden="0" w:name="Medium Grid 1"/>
+    <w:lsdException w:unhideWhenUsed="0" w:uiPriority="67" w:semiHidden="0" w:name="Medium Grid 1"/>
     <w:lsdException w:unhideWhenUsed="0" w:uiPriority="68" w:semiHidden="0" w:name="Medium Grid 2"/>
     <w:lsdException w:unhideWhenUsed="0" w:uiPriority="69" w:semiHidden="0" w:name="Medium Grid 3"/>
     <w:lsdException w:unhideWhenUsed="0" w:uiPriority="70" w:semiHidden="0" w:name="Dark List"/>
     <w:lsdException w:unhideWhenUsed="0" w:uiPriority="71" w:semiHidden="0" w:name="Colorful Shading"/>
-    <w:lsdException w:qFormat="1" w:unhideWhenUsed="0" w:uiPriority="72" w:semiHidden="0" w:name="Colorful List"/>
-    <w:lsdException w:qFormat="1" w:unhideWhenUsed="0" w:uiPriority="73" w:semiHidden="0" w:name="Colorful Grid"/>
-    <w:lsdException w:qFormat="1" w:unhideWhenUsed="0" w:uiPriority="60" w:semiHidden="0" w:name="Light Shading Accent 1"/>
-    <w:lsdException w:qFormat="1" w:unhideWhenUsed="0" w:uiPriority="61" w:semiHidden="0" w:name="Light List Accent 1"/>
-    <w:lsdException w:qFormat="1" w:unhideWhenUsed="0" w:uiPriority="62" w:semiHidden="0" w:name="Light Grid Accent 1"/>
-    <w:lsdException w:qFormat="1" w:unhideWhenUsed="0" w:uiPriority="63" w:semiHidden="0" w:name="Medium Shading 1 Accent 1"/>
-    <w:lsdException w:qFormat="1" w:unhideWhenUsed="0" w:uiPriority="64" w:semiHidden="0" w:name="Medium Shading 2 Accent 1"/>
+    <w:lsdException w:unhideWhenUsed="0" w:uiPriority="72" w:semiHidden="0" w:name="Colorful List"/>
+    <w:lsdException w:unhideWhenUsed="0" w:uiPriority="73" w:semiHidden="0" w:name="Colorful Grid"/>
+    <w:lsdException w:unhideWhenUsed="0" w:uiPriority="60" w:semiHidden="0" w:name="Light Shading Accent 1"/>
+    <w:lsdException w:unhideWhenUsed="0" w:uiPriority="61" w:semiHidden="0" w:name="Light List Accent 1"/>
+    <w:lsdException w:unhideWhenUsed="0" w:uiPriority="62" w:semiHidden="0" w:name="Light Grid Accent 1"/>
+    <w:lsdException w:unhideWhenUsed="0" w:uiPriority="63" w:semiHidden="0" w:name="Medium Shading 1 Accent 1"/>
+    <w:lsdException w:unhideWhenUsed="0" w:uiPriority="64" w:semiHidden="0" w:name="Medium Shading 2 Accent 1"/>
     <w:lsdException w:unhideWhenUsed="0" w:uiPriority="65" w:semiHidden="0" w:name="Medium List 1 Accent 1"/>
     <w:lsdException w:qFormat="1" w:unhideWhenUsed="0" w:uiPriority="34" w:semiHidden="0" w:name="List Paragraph"/>
     <w:lsdException w:qFormat="1" w:unhideWhenUsed="0" w:uiPriority="29" w:semiHidden="0" w:name="Quote"/>
     <w:lsdException w:qFormat="1" w:unhideWhenUsed="0" w:uiPriority="30" w:semiHidden="0" w:name="Intense Quote"/>
     <w:lsdException w:unhideWhenUsed="0" w:uiPriority="66" w:semiHidden="0" w:name="Medium List 2 Accent 1"/>
-    <w:lsdException w:qFormat="1" w:unhideWhenUsed="0" w:uiPriority="67" w:semiHidden="0" w:name="Medium Grid 1 Accent 1"/>
+    <w:lsdException w:unhideWhenUsed="0" w:uiPriority="67" w:semiHidden="0" w:name="Medium Grid 1 Accent 1"/>
     <w:lsdException w:unhideWhenUsed="0" w:uiPriority="68" w:semiHidden="0" w:name="Medium Grid 2 Accent 1"/>
     <w:lsdException w:unhideWhenUsed="0" w:uiPriority="69" w:semiHidden="0" w:name="Medium Grid 3 Accent 1"/>
     <w:lsdException w:unhideWhenUsed="0" w:uiPriority="70" w:semiHidden="0" w:name="Dark List Accent 1"/>
     <w:lsdException w:unhideWhenUsed="0" w:uiPriority="71" w:semiHidden="0" w:name="Colorful Shading Accent 1"/>
-    <w:lsdException w:qFormat="1" w:unhideWhenUsed="0" w:uiPriority="72" w:semiHidden="0" w:name="Colorful List Accent 1"/>
-    <w:lsdException w:qFormat="1" w:unhideWhenUsed="0" w:uiPriority="73" w:semiHidden="0" w:name="Colorful Grid Accent 1"/>
-    <w:lsdException w:qFormat="1" w:unhideWhenUsed="0" w:uiPriority="60" w:semiHidden="0" w:name="Light Shading Accent 2"/>
-    <w:lsdException w:qFormat="1" w:unhideWhenUsed="0" w:uiPriority="61" w:semiHidden="0" w:name="Light List Accent 2"/>
-    <w:lsdException w:qFormat="1" w:unhideWhenUsed="0" w:uiPriority="62" w:semiHidden="0" w:name="Light Grid Accent 2"/>
-    <w:lsdException w:qFormat="1" w:unhideWhenUsed="0" w:uiPriority="63" w:semiHidden="0" w:name="Medium Shading 1 Accent 2"/>
+    <w:lsdException w:unhideWhenUsed="0" w:uiPriority="72" w:semiHidden="0" w:name="Colorful List Accent 1"/>
+    <w:lsdException w:unhideWhenUsed="0" w:uiPriority="73" w:semiHidden="0" w:name="Colorful Grid Accent 1"/>
+    <w:lsdException w:unhideWhenUsed="0" w:uiPriority="60" w:semiHidden="0" w:name="Light Shading Accent 2"/>
+    <w:lsdException w:unhideWhenUsed="0" w:uiPriority="61" w:semiHidden="0" w:name="Light List Accent 2"/>
+    <w:lsdException w:unhideWhenUsed="0" w:uiPriority="62" w:semiHidden="0" w:name="Light Grid Accent 2"/>
+    <w:lsdException w:unhideWhenUsed="0" w:uiPriority="63" w:semiHidden="0" w:name="Medium Shading 1 Accent 2"/>
     <w:lsdException w:unhideWhenUsed="0" w:uiPriority="64" w:semiHidden="0" w:name="Medium Shading 2 Accent 2"/>
     <w:lsdException w:unhideWhenUsed="0" w:uiPriority="65" w:semiHidden="0" w:name="Medium List 1 Accent 2"/>
     <w:lsdException w:unhideWhenUsed="0" w:uiPriority="66" w:semiHidden="0" w:name="Medium List 2 Accent 2"/>
@@ -17833,64 +18411,64 @@
     <w:lsdException w:unhideWhenUsed="0" w:uiPriority="69" w:semiHidden="0" w:name="Medium Grid 3 Accent 2"/>
     <w:lsdException w:unhideWhenUsed="0" w:uiPriority="70" w:semiHidden="0" w:name="Dark List Accent 2"/>
     <w:lsdException w:unhideWhenUsed="0" w:uiPriority="71" w:semiHidden="0" w:name="Colorful Shading Accent 2"/>
-    <w:lsdException w:qFormat="1" w:unhideWhenUsed="0" w:uiPriority="72" w:semiHidden="0" w:name="Colorful List Accent 2"/>
-    <w:lsdException w:qFormat="1" w:unhideWhenUsed="0" w:uiPriority="73" w:semiHidden="0" w:name="Colorful Grid Accent 2"/>
-    <w:lsdException w:qFormat="1" w:unhideWhenUsed="0" w:uiPriority="60" w:semiHidden="0" w:name="Light Shading Accent 3"/>
-    <w:lsdException w:qFormat="1" w:unhideWhenUsed="0" w:uiPriority="61" w:semiHidden="0" w:name="Light List Accent 3"/>
-    <w:lsdException w:qFormat="1" w:unhideWhenUsed="0" w:uiPriority="62" w:semiHidden="0" w:name="Light Grid Accent 3"/>
-    <w:lsdException w:qFormat="1" w:unhideWhenUsed="0" w:uiPriority="63" w:semiHidden="0" w:name="Medium Shading 1 Accent 3"/>
+    <w:lsdException w:unhideWhenUsed="0" w:uiPriority="72" w:semiHidden="0" w:name="Colorful List Accent 2"/>
+    <w:lsdException w:unhideWhenUsed="0" w:uiPriority="73" w:semiHidden="0" w:name="Colorful Grid Accent 2"/>
+    <w:lsdException w:unhideWhenUsed="0" w:uiPriority="60" w:semiHidden="0" w:name="Light Shading Accent 3"/>
+    <w:lsdException w:unhideWhenUsed="0" w:uiPriority="61" w:semiHidden="0" w:name="Light List Accent 3"/>
+    <w:lsdException w:unhideWhenUsed="0" w:uiPriority="62" w:semiHidden="0" w:name="Light Grid Accent 3"/>
+    <w:lsdException w:unhideWhenUsed="0" w:uiPriority="63" w:semiHidden="0" w:name="Medium Shading 1 Accent 3"/>
     <w:lsdException w:unhideWhenUsed="0" w:uiPriority="64" w:semiHidden="0" w:name="Medium Shading 2 Accent 3"/>
     <w:lsdException w:unhideWhenUsed="0" w:uiPriority="65" w:semiHidden="0" w:name="Medium List 1 Accent 3"/>
     <w:lsdException w:unhideWhenUsed="0" w:uiPriority="66" w:semiHidden="0" w:name="Medium List 2 Accent 3"/>
     <w:lsdException w:unhideWhenUsed="0" w:uiPriority="67" w:semiHidden="0" w:name="Medium Grid 1 Accent 3"/>
     <w:lsdException w:unhideWhenUsed="0" w:uiPriority="68" w:semiHidden="0" w:name="Medium Grid 2 Accent 3"/>
-    <w:lsdException w:qFormat="1" w:unhideWhenUsed="0" w:uiPriority="69" w:semiHidden="0" w:name="Medium Grid 3 Accent 3"/>
+    <w:lsdException w:unhideWhenUsed="0" w:uiPriority="69" w:semiHidden="0" w:name="Medium Grid 3 Accent 3"/>
     <w:lsdException w:unhideWhenUsed="0" w:uiPriority="70" w:semiHidden="0" w:name="Dark List Accent 3"/>
     <w:lsdException w:unhideWhenUsed="0" w:uiPriority="71" w:semiHidden="0" w:name="Colorful Shading Accent 3"/>
-    <w:lsdException w:qFormat="1" w:unhideWhenUsed="0" w:uiPriority="72" w:semiHidden="0" w:name="Colorful List Accent 3"/>
+    <w:lsdException w:unhideWhenUsed="0" w:uiPriority="72" w:semiHidden="0" w:name="Colorful List Accent 3"/>
     <w:lsdException w:unhideWhenUsed="0" w:uiPriority="73" w:semiHidden="0" w:name="Colorful Grid Accent 3"/>
-    <w:lsdException w:qFormat="1" w:unhideWhenUsed="0" w:uiPriority="60" w:semiHidden="0" w:name="Light Shading Accent 4"/>
-    <w:lsdException w:qFormat="1" w:unhideWhenUsed="0" w:uiPriority="61" w:semiHidden="0" w:name="Light List Accent 4"/>
-    <w:lsdException w:qFormat="1" w:unhideWhenUsed="0" w:uiPriority="62" w:semiHidden="0" w:name="Light Grid Accent 4"/>
+    <w:lsdException w:unhideWhenUsed="0" w:uiPriority="60" w:semiHidden="0" w:name="Light Shading Accent 4"/>
+    <w:lsdException w:unhideWhenUsed="0" w:uiPriority="61" w:semiHidden="0" w:name="Light List Accent 4"/>
+    <w:lsdException w:unhideWhenUsed="0" w:uiPriority="62" w:semiHidden="0" w:name="Light Grid Accent 4"/>
     <w:lsdException w:unhideWhenUsed="0" w:uiPriority="63" w:semiHidden="0" w:name="Medium Shading 1 Accent 4"/>
     <w:lsdException w:unhideWhenUsed="0" w:uiPriority="64" w:semiHidden="0" w:name="Medium Shading 2 Accent 4"/>
-    <w:lsdException w:qFormat="1" w:unhideWhenUsed="0" w:uiPriority="65" w:semiHidden="0" w:name="Medium List 1 Accent 4"/>
+    <w:lsdException w:unhideWhenUsed="0" w:uiPriority="65" w:semiHidden="0" w:name="Medium List 1 Accent 4"/>
     <w:lsdException w:unhideWhenUsed="0" w:uiPriority="66" w:semiHidden="0" w:name="Medium List 2 Accent 4"/>
     <w:lsdException w:unhideWhenUsed="0" w:uiPriority="67" w:semiHidden="0" w:name="Medium Grid 1 Accent 4"/>
     <w:lsdException w:unhideWhenUsed="0" w:uiPriority="68" w:semiHidden="0" w:name="Medium Grid 2 Accent 4"/>
     <w:lsdException w:unhideWhenUsed="0" w:uiPriority="69" w:semiHidden="0" w:name="Medium Grid 3 Accent 4"/>
     <w:lsdException w:unhideWhenUsed="0" w:uiPriority="70" w:semiHidden="0" w:name="Dark List Accent 4"/>
     <w:lsdException w:unhideWhenUsed="0" w:uiPriority="71" w:semiHidden="0" w:name="Colorful Shading Accent 4"/>
-    <w:lsdException w:qFormat="1" w:unhideWhenUsed="0" w:uiPriority="72" w:semiHidden="0" w:name="Colorful List Accent 4"/>
-    <w:lsdException w:qFormat="1" w:unhideWhenUsed="0" w:uiPriority="73" w:semiHidden="0" w:name="Colorful Grid Accent 4"/>
-    <w:lsdException w:qFormat="1" w:unhideWhenUsed="0" w:uiPriority="60" w:semiHidden="0" w:name="Light Shading Accent 5"/>
-    <w:lsdException w:qFormat="1" w:unhideWhenUsed="0" w:uiPriority="61" w:semiHidden="0" w:name="Light List Accent 5"/>
-    <w:lsdException w:qFormat="1" w:unhideWhenUsed="0" w:uiPriority="62" w:semiHidden="0" w:name="Light Grid Accent 5"/>
+    <w:lsdException w:unhideWhenUsed="0" w:uiPriority="72" w:semiHidden="0" w:name="Colorful List Accent 4"/>
+    <w:lsdException w:unhideWhenUsed="0" w:uiPriority="73" w:semiHidden="0" w:name="Colorful Grid Accent 4"/>
+    <w:lsdException w:unhideWhenUsed="0" w:uiPriority="60" w:semiHidden="0" w:name="Light Shading Accent 5"/>
+    <w:lsdException w:unhideWhenUsed="0" w:uiPriority="61" w:semiHidden="0" w:name="Light List Accent 5"/>
+    <w:lsdException w:unhideWhenUsed="0" w:uiPriority="62" w:semiHidden="0" w:name="Light Grid Accent 5"/>
     <w:lsdException w:unhideWhenUsed="0" w:uiPriority="63" w:semiHidden="0" w:name="Medium Shading 1 Accent 5"/>
     <w:lsdException w:unhideWhenUsed="0" w:uiPriority="64" w:semiHidden="0" w:name="Medium Shading 2 Accent 5"/>
-    <w:lsdException w:qFormat="1" w:unhideWhenUsed="0" w:uiPriority="65" w:semiHidden="0" w:name="Medium List 1 Accent 5"/>
+    <w:lsdException w:unhideWhenUsed="0" w:uiPriority="65" w:semiHidden="0" w:name="Medium List 1 Accent 5"/>
     <w:lsdException w:unhideWhenUsed="0" w:uiPriority="66" w:semiHidden="0" w:name="Medium List 2 Accent 5"/>
     <w:lsdException w:unhideWhenUsed="0" w:uiPriority="67" w:semiHidden="0" w:name="Medium Grid 1 Accent 5"/>
     <w:lsdException w:unhideWhenUsed="0" w:uiPriority="68" w:semiHidden="0" w:name="Medium Grid 2 Accent 5"/>
-    <w:lsdException w:qFormat="1" w:unhideWhenUsed="0" w:uiPriority="69" w:semiHidden="0" w:name="Medium Grid 3 Accent 5"/>
+    <w:lsdException w:unhideWhenUsed="0" w:uiPriority="69" w:semiHidden="0" w:name="Medium Grid 3 Accent 5"/>
     <w:lsdException w:unhideWhenUsed="0" w:uiPriority="70" w:semiHidden="0" w:name="Dark List Accent 5"/>
-    <w:lsdException w:qFormat="1" w:unhideWhenUsed="0" w:uiPriority="71" w:semiHidden="0" w:name="Colorful Shading Accent 5"/>
+    <w:lsdException w:unhideWhenUsed="0" w:uiPriority="71" w:semiHidden="0" w:name="Colorful Shading Accent 5"/>
     <w:lsdException w:unhideWhenUsed="0" w:uiPriority="72" w:semiHidden="0" w:name="Colorful List Accent 5"/>
-    <w:lsdException w:qFormat="1" w:unhideWhenUsed="0" w:uiPriority="73" w:semiHidden="0" w:name="Colorful Grid Accent 5"/>
-    <w:lsdException w:qFormat="1" w:unhideWhenUsed="0" w:uiPriority="60" w:semiHidden="0" w:name="Light Shading Accent 6"/>
-    <w:lsdException w:qFormat="1" w:unhideWhenUsed="0" w:uiPriority="61" w:semiHidden="0" w:name="Light List Accent 6"/>
-    <w:lsdException w:qFormat="1" w:unhideWhenUsed="0" w:uiPriority="62" w:semiHidden="0" w:name="Light Grid Accent 6"/>
+    <w:lsdException w:unhideWhenUsed="0" w:uiPriority="73" w:semiHidden="0" w:name="Colorful Grid Accent 5"/>
+    <w:lsdException w:unhideWhenUsed="0" w:uiPriority="60" w:semiHidden="0" w:name="Light Shading Accent 6"/>
+    <w:lsdException w:unhideWhenUsed="0" w:uiPriority="61" w:semiHidden="0" w:name="Light List Accent 6"/>
+    <w:lsdException w:unhideWhenUsed="0" w:uiPriority="62" w:semiHidden="0" w:name="Light Grid Accent 6"/>
     <w:lsdException w:unhideWhenUsed="0" w:uiPriority="63" w:semiHidden="0" w:name="Medium Shading 1 Accent 6"/>
     <w:lsdException w:unhideWhenUsed="0" w:uiPriority="64" w:semiHidden="0" w:name="Medium Shading 2 Accent 6"/>
-    <w:lsdException w:qFormat="1" w:unhideWhenUsed="0" w:uiPriority="65" w:semiHidden="0" w:name="Medium List 1 Accent 6"/>
+    <w:lsdException w:unhideWhenUsed="0" w:uiPriority="65" w:semiHidden="0" w:name="Medium List 1 Accent 6"/>
     <w:lsdException w:unhideWhenUsed="0" w:uiPriority="66" w:semiHidden="0" w:name="Medium List 2 Accent 6"/>
     <w:lsdException w:unhideWhenUsed="0" w:uiPriority="67" w:semiHidden="0" w:name="Medium Grid 1 Accent 6"/>
     <w:lsdException w:unhideWhenUsed="0" w:uiPriority="68" w:semiHidden="0" w:name="Medium Grid 2 Accent 6"/>
     <w:lsdException w:unhideWhenUsed="0" w:uiPriority="69" w:semiHidden="0" w:name="Medium Grid 3 Accent 6"/>
     <w:lsdException w:unhideWhenUsed="0" w:uiPriority="70" w:semiHidden="0" w:name="Dark List Accent 6"/>
-    <w:lsdException w:qFormat="1" w:unhideWhenUsed="0" w:uiPriority="71" w:semiHidden="0" w:name="Colorful Shading Accent 6"/>
-    <w:lsdException w:qFormat="1" w:unhideWhenUsed="0" w:uiPriority="72" w:semiHidden="0" w:name="Colorful List Accent 6"/>
-    <w:lsdException w:qFormat="1" w:unhideWhenUsed="0" w:uiPriority="73" w:semiHidden="0" w:name="Colorful Grid Accent 6"/>
+    <w:lsdException w:unhideWhenUsed="0" w:uiPriority="71" w:semiHidden="0" w:name="Colorful Shading Accent 6"/>
+    <w:lsdException w:unhideWhenUsed="0" w:uiPriority="72" w:semiHidden="0" w:name="Colorful List Accent 6"/>
+    <w:lsdException w:unhideWhenUsed="0" w:uiPriority="73" w:semiHidden="0" w:name="Colorful Grid Accent 6"/>
   </w:latentStyles>
   <w:style w:type="paragraph" w:default="1" w:styleId="1">
     <w:name w:val="Normal"/>
@@ -18146,7 +18724,6 @@
     <w:name w:val="Default Paragraph Font"/>
     <w:semiHidden/>
     <w:unhideWhenUsed/>
-    <w:qFormat/>
     <w:uiPriority w:val="1"/>
   </w:style>
   <w:style w:type="table" w:default="1" w:styleId="32">
@@ -18191,7 +18768,6 @@
     <w:name w:val="List 3"/>
     <w:basedOn w:val="1"/>
     <w:unhideWhenUsed/>
-    <w:qFormat/>
     <w:uiPriority w:val="99"/>
     <w:pPr>
       <w:ind w:left="1080" w:hanging="360"/>
@@ -18202,7 +18778,6 @@
     <w:name w:val="List Number 2"/>
     <w:basedOn w:val="1"/>
     <w:unhideWhenUsed/>
-    <w:qFormat/>
     <w:uiPriority w:val="99"/>
     <w:pPr>
       <w:numPr>
@@ -18216,7 +18791,6 @@
     <w:name w:val="List Number"/>
     <w:basedOn w:val="1"/>
     <w:unhideWhenUsed/>
-    <w:qFormat/>
     <w:uiPriority w:val="99"/>
     <w:pPr>
       <w:numPr>
@@ -18268,7 +18842,6 @@
     <w:basedOn w:val="1"/>
     <w:link w:val="146"/>
     <w:unhideWhenUsed/>
-    <w:qFormat/>
     <w:uiPriority w:val="99"/>
     <w:pPr>
       <w:spacing w:after="120"/>
@@ -18296,7 +18869,6 @@
     <w:basedOn w:val="1"/>
     <w:link w:val="144"/>
     <w:unhideWhenUsed/>
-    <w:qFormat/>
     <w:uiPriority w:val="99"/>
     <w:pPr>
       <w:spacing w:after="120"/>
@@ -18306,7 +18878,6 @@
     <w:name w:val="List Number 3"/>
     <w:basedOn w:val="1"/>
     <w:unhideWhenUsed/>
-    <w:qFormat/>
     <w:uiPriority w:val="99"/>
     <w:pPr>
       <w:numPr>
@@ -18320,7 +18891,6 @@
     <w:name w:val="List 2"/>
     <w:basedOn w:val="1"/>
     <w:unhideWhenUsed/>
-    <w:qFormat/>
     <w:uiPriority w:val="99"/>
     <w:pPr>
       <w:ind w:left="720" w:hanging="360"/>
@@ -18331,7 +18901,6 @@
     <w:name w:val="List Continue"/>
     <w:basedOn w:val="1"/>
     <w:unhideWhenUsed/>
-    <w:qFormat/>
     <w:uiPriority w:val="99"/>
     <w:pPr>
       <w:spacing w:after="120"/>
@@ -18343,7 +18912,6 @@
     <w:name w:val="List Bullet 2"/>
     <w:basedOn w:val="1"/>
     <w:unhideWhenUsed/>
-    <w:qFormat/>
     <w:uiPriority w:val="99"/>
     <w:pPr>
       <w:numPr>
@@ -18407,7 +18975,6 @@
     <w:name w:val="List"/>
     <w:basedOn w:val="1"/>
     <w:unhideWhenUsed/>
-    <w:qFormat/>
     <w:uiPriority w:val="99"/>
     <w:pPr>
       <w:ind w:left="360" w:hanging="360"/>
@@ -18419,7 +18986,6 @@
     <w:basedOn w:val="1"/>
     <w:link w:val="145"/>
     <w:unhideWhenUsed/>
-    <w:qFormat/>
     <w:uiPriority w:val="99"/>
     <w:pPr>
       <w:spacing w:after="120" w:line="480" w:lineRule="auto"/>
@@ -18429,7 +18995,6 @@
     <w:name w:val="List Continue 2"/>
     <w:basedOn w:val="1"/>
     <w:unhideWhenUsed/>
-    <w:qFormat/>
     <w:uiPriority w:val="99"/>
     <w:pPr>
       <w:spacing w:after="120"/>
@@ -18441,7 +19006,6 @@
     <w:name w:val="List Continue 3"/>
     <w:basedOn w:val="1"/>
     <w:unhideWhenUsed/>
-    <w:qFormat/>
     <w:uiPriority w:val="99"/>
     <w:pPr>
       <w:spacing w:after="120"/>
@@ -18475,7 +19039,6 @@
   <w:style w:type="table" w:styleId="33">
     <w:name w:val="Table Grid"/>
     <w:basedOn w:val="32"/>
-    <w:qFormat/>
     <w:uiPriority w:val="59"/>
     <w:pPr>
       <w:spacing w:after="0" w:line="240" w:lineRule="auto"/>
@@ -18500,7 +19063,6 @@
   <w:style w:type="table" w:styleId="34">
     <w:name w:val="Light Shading"/>
     <w:basedOn w:val="32"/>
-    <w:qFormat/>
     <w:uiPriority w:val="60"/>
     <w:pPr>
       <w:spacing w:after="0" w:line="240" w:lineRule="auto"/>
@@ -18600,7 +19162,6 @@
   <w:style w:type="table" w:styleId="35">
     <w:name w:val="Light Shading Accent 1"/>
     <w:basedOn w:val="32"/>
-    <w:qFormat/>
     <w:uiPriority w:val="60"/>
     <w:pPr>
       <w:spacing w:after="0" w:line="240" w:lineRule="auto"/>
@@ -18700,7 +19261,6 @@
   <w:style w:type="table" w:styleId="36">
     <w:name w:val="Light Shading Accent 2"/>
     <w:basedOn w:val="32"/>
-    <w:qFormat/>
     <w:uiPriority w:val="60"/>
     <w:pPr>
       <w:spacing w:after="0" w:line="240" w:lineRule="auto"/>
@@ -18800,7 +19360,6 @@
   <w:style w:type="table" w:styleId="37">
     <w:name w:val="Light Shading Accent 3"/>
     <w:basedOn w:val="32"/>
-    <w:qFormat/>
     <w:uiPriority w:val="60"/>
     <w:pPr>
       <w:spacing w:after="0" w:line="240" w:lineRule="auto"/>
@@ -18900,7 +19459,6 @@
   <w:style w:type="table" w:styleId="38">
     <w:name w:val="Light Shading Accent 4"/>
     <w:basedOn w:val="32"/>
-    <w:qFormat/>
     <w:uiPriority w:val="60"/>
     <w:pPr>
       <w:spacing w:after="0" w:line="240" w:lineRule="auto"/>
@@ -19000,7 +19558,6 @@
   <w:style w:type="table" w:styleId="39">
     <w:name w:val="Light Shading Accent 5"/>
     <w:basedOn w:val="32"/>
-    <w:qFormat/>
     <w:uiPriority w:val="60"/>
     <w:pPr>
       <w:spacing w:after="0" w:line="240" w:lineRule="auto"/>
@@ -19100,7 +19657,6 @@
   <w:style w:type="table" w:styleId="40">
     <w:name w:val="Light Shading Accent 6"/>
     <w:basedOn w:val="32"/>
-    <w:qFormat/>
     <w:uiPriority w:val="60"/>
     <w:pPr>
       <w:spacing w:after="0" w:line="240" w:lineRule="auto"/>
@@ -19200,7 +19756,6 @@
   <w:style w:type="table" w:styleId="41">
     <w:name w:val="Light List"/>
     <w:basedOn w:val="32"/>
-    <w:qFormat/>
     <w:uiPriority w:val="61"/>
     <w:pPr>
       <w:spacing w:after="0" w:line="240" w:lineRule="auto"/>
@@ -19294,7 +19849,6 @@
   <w:style w:type="table" w:styleId="42">
     <w:name w:val="Light List Accent 1"/>
     <w:basedOn w:val="32"/>
-    <w:qFormat/>
     <w:uiPriority w:val="61"/>
     <w:pPr>
       <w:spacing w:after="0" w:line="240" w:lineRule="auto"/>
@@ -19388,7 +19942,6 @@
   <w:style w:type="table" w:styleId="43">
     <w:name w:val="Light List Accent 2"/>
     <w:basedOn w:val="32"/>
-    <w:qFormat/>
     <w:uiPriority w:val="61"/>
     <w:pPr>
       <w:spacing w:after="0" w:line="240" w:lineRule="auto"/>
@@ -19482,7 +20035,6 @@
   <w:style w:type="table" w:styleId="44">
     <w:name w:val="Light List Accent 3"/>
     <w:basedOn w:val="32"/>
-    <w:qFormat/>
     <w:uiPriority w:val="61"/>
     <w:pPr>
       <w:spacing w:after="0" w:line="240" w:lineRule="auto"/>
@@ -19576,7 +20128,6 @@
   <w:style w:type="table" w:styleId="45">
     <w:name w:val="Light List Accent 4"/>
     <w:basedOn w:val="32"/>
-    <w:qFormat/>
     <w:uiPriority w:val="61"/>
     <w:pPr>
       <w:spacing w:after="0" w:line="240" w:lineRule="auto"/>
@@ -19670,7 +20221,6 @@
   <w:style w:type="table" w:styleId="46">
     <w:name w:val="Light List Accent 5"/>
     <w:basedOn w:val="32"/>
-    <w:qFormat/>
     <w:uiPriority w:val="61"/>
     <w:pPr>
       <w:spacing w:after="0" w:line="240" w:lineRule="auto"/>
@@ -19764,7 +20314,6 @@
   <w:style w:type="table" w:styleId="47">
     <w:name w:val="Light List Accent 6"/>
     <w:basedOn w:val="32"/>
-    <w:qFormat/>
     <w:uiPriority w:val="61"/>
     <w:pPr>
       <w:spacing w:after="0" w:line="240" w:lineRule="auto"/>
@@ -19858,7 +20407,6 @@
   <w:style w:type="table" w:styleId="48">
     <w:name w:val="Light Grid"/>
     <w:basedOn w:val="32"/>
-    <w:qFormat/>
     <w:uiPriority w:val="62"/>
     <w:pPr>
       <w:spacing w:after="0" w:line="240" w:lineRule="auto"/>
@@ -19985,7 +20533,6 @@
   <w:style w:type="table" w:styleId="49">
     <w:name w:val="Light Grid Accent 1"/>
     <w:basedOn w:val="32"/>
-    <w:qFormat/>
     <w:uiPriority w:val="62"/>
     <w:pPr>
       <w:spacing w:after="0" w:line="240" w:lineRule="auto"/>
@@ -20112,7 +20659,6 @@
   <w:style w:type="table" w:styleId="50">
     <w:name w:val="Light Grid Accent 2"/>
     <w:basedOn w:val="32"/>
-    <w:qFormat/>
     <w:uiPriority w:val="62"/>
     <w:pPr>
       <w:spacing w:after="0" w:line="240" w:lineRule="auto"/>
@@ -20239,7 +20785,6 @@
   <w:style w:type="table" w:styleId="51">
     <w:name w:val="Light Grid Accent 3"/>
     <w:basedOn w:val="32"/>
-    <w:qFormat/>
     <w:uiPriority w:val="62"/>
     <w:pPr>
       <w:spacing w:after="0" w:line="240" w:lineRule="auto"/>
@@ -20366,7 +20911,6 @@
   <w:style w:type="table" w:styleId="52">
     <w:name w:val="Light Grid Accent 4"/>
     <w:basedOn w:val="32"/>
-    <w:qFormat/>
     <w:uiPriority w:val="62"/>
     <w:pPr>
       <w:spacing w:after="0" w:line="240" w:lineRule="auto"/>
@@ -20493,7 +21037,6 @@
   <w:style w:type="table" w:styleId="53">
     <w:name w:val="Light Grid Accent 5"/>
     <w:basedOn w:val="32"/>
-    <w:qFormat/>
     <w:uiPriority w:val="62"/>
     <w:pPr>
       <w:spacing w:after="0" w:line="240" w:lineRule="auto"/>
@@ -20620,7 +21163,6 @@
   <w:style w:type="table" w:styleId="54">
     <w:name w:val="Light Grid Accent 6"/>
     <w:basedOn w:val="32"/>
-    <w:qFormat/>
     <w:uiPriority w:val="62"/>
     <w:pPr>
       <w:spacing w:after="0" w:line="240" w:lineRule="auto"/>
@@ -20747,7 +21289,6 @@
   <w:style w:type="table" w:styleId="55">
     <w:name w:val="Medium Shading 1"/>
     <w:basedOn w:val="32"/>
-    <w:qFormat/>
     <w:uiPriority w:val="63"/>
     <w:pPr>
       <w:spacing w:after="0" w:line="240" w:lineRule="auto"/>
@@ -20855,7 +21396,6 @@
   <w:style w:type="table" w:styleId="56">
     <w:name w:val="Medium Shading 1 Accent 1"/>
     <w:basedOn w:val="32"/>
-    <w:qFormat/>
     <w:uiPriority w:val="63"/>
     <w:pPr>
       <w:spacing w:after="0" w:line="240" w:lineRule="auto"/>
@@ -20963,7 +21503,6 @@
   <w:style w:type="table" w:styleId="57">
     <w:name w:val="Medium Shading 1 Accent 2"/>
     <w:basedOn w:val="32"/>
-    <w:qFormat/>
     <w:uiPriority w:val="63"/>
     <w:pPr>
       <w:spacing w:after="0" w:line="240" w:lineRule="auto"/>
@@ -21071,7 +21610,6 @@
   <w:style w:type="table" w:styleId="58">
     <w:name w:val="Medium Shading 1 Accent 3"/>
     <w:basedOn w:val="32"/>
-    <w:qFormat/>
     <w:uiPriority w:val="63"/>
     <w:pPr>
       <w:spacing w:after="0" w:line="240" w:lineRule="auto"/>
@@ -21665,7 +22203,6 @@
   <w:style w:type="table" w:styleId="63">
     <w:name w:val="Medium Shading 2 Accent 1"/>
     <w:basedOn w:val="32"/>
-    <w:qFormat/>
     <w:uiPriority w:val="64"/>
     <w:pPr>
       <w:spacing w:after="0" w:line="240" w:lineRule="auto"/>
@@ -23016,7 +23553,6 @@
   <w:style w:type="table" w:styleId="73">
     <w:name w:val="Medium List 1 Accent 4"/>
     <w:basedOn w:val="32"/>
-    <w:qFormat/>
     <w:uiPriority w:val="65"/>
     <w:pPr>
       <w:spacing w:after="0" w:line="240" w:lineRule="auto"/>
@@ -23107,7 +23643,6 @@
   <w:style w:type="table" w:styleId="74">
     <w:name w:val="Medium List 1 Accent 5"/>
     <w:basedOn w:val="32"/>
-    <w:qFormat/>
     <w:uiPriority w:val="65"/>
     <w:pPr>
       <w:spacing w:after="0" w:line="240" w:lineRule="auto"/>
@@ -23198,7 +23733,6 @@
   <w:style w:type="table" w:styleId="75">
     <w:name w:val="Medium List 1 Accent 6"/>
     <w:basedOn w:val="32"/>
-    <w:qFormat/>
     <w:uiPriority w:val="65"/>
     <w:pPr>
       <w:spacing w:after="0" w:line="240" w:lineRule="auto"/>
@@ -24192,7 +24726,6 @@
   <w:style w:type="table" w:styleId="83">
     <w:name w:val="Medium Grid 1"/>
     <w:basedOn w:val="32"/>
-    <w:qFormat/>
     <w:uiPriority w:val="67"/>
     <w:pPr>
       <w:spacing w:after="0" w:line="240" w:lineRule="auto"/>
@@ -24262,7 +24795,6 @@
   <w:style w:type="table" w:styleId="84">
     <w:name w:val="Medium Grid 1 Accent 1"/>
     <w:basedOn w:val="32"/>
-    <w:qFormat/>
     <w:uiPriority w:val="67"/>
     <w:pPr>
       <w:spacing w:after="0" w:line="240" w:lineRule="auto"/>
@@ -26170,7 +26702,6 @@
   <w:style w:type="table" w:styleId="100">
     <w:name w:val="Medium Grid 3 Accent 3"/>
     <w:basedOn w:val="32"/>
-    <w:qFormat/>
     <w:uiPriority w:val="69"/>
     <w:pPr>
       <w:spacing w:after="0" w:line="240" w:lineRule="auto"/>
@@ -26485,7 +27016,6 @@
   <w:style w:type="table" w:styleId="102">
     <w:name w:val="Medium Grid 3 Accent 5"/>
     <w:basedOn w:val="32"/>
-    <w:qFormat/>
     <w:uiPriority w:val="69"/>
     <w:pPr>
       <w:spacing w:after="0" w:line="240" w:lineRule="auto"/>
@@ -28325,7 +28855,6 @@
   <w:style w:type="table" w:styleId="116">
     <w:name w:val="Colorful Shading Accent 5"/>
     <w:basedOn w:val="32"/>
-    <w:qFormat/>
     <w:uiPriority w:val="71"/>
     <w:pPr>
       <w:spacing w:after="0" w:line="240" w:lineRule="auto"/>
@@ -28474,7 +29003,6 @@
   <w:style w:type="table" w:styleId="117">
     <w:name w:val="Colorful Shading Accent 6"/>
     <w:basedOn w:val="32"/>
-    <w:qFormat/>
     <w:uiPriority w:val="71"/>
     <w:pPr>
       <w:spacing w:after="0" w:line="240" w:lineRule="auto"/>
@@ -28623,7 +29151,6 @@
   <w:style w:type="table" w:styleId="118">
     <w:name w:val="Colorful List"/>
     <w:basedOn w:val="32"/>
-    <w:qFormat/>
     <w:uiPriority w:val="72"/>
     <w:pPr>
       <w:spacing w:after="0" w:line="240" w:lineRule="auto"/>
@@ -28716,7 +29243,6 @@
   <w:style w:type="table" w:styleId="119">
     <w:name w:val="Colorful List Accent 1"/>
     <w:basedOn w:val="32"/>
-    <w:qFormat/>
     <w:uiPriority w:val="72"/>
     <w:pPr>
       <w:spacing w:after="0" w:line="240" w:lineRule="auto"/>
@@ -28809,7 +29335,6 @@
   <w:style w:type="table" w:styleId="120">
     <w:name w:val="Colorful List Accent 2"/>
     <w:basedOn w:val="32"/>
-    <w:qFormat/>
     <w:uiPriority w:val="72"/>
     <w:pPr>
       <w:spacing w:after="0" w:line="240" w:lineRule="auto"/>
@@ -28902,7 +29427,6 @@
   <w:style w:type="table" w:styleId="121">
     <w:name w:val="Colorful List Accent 3"/>
     <w:basedOn w:val="32"/>
-    <w:qFormat/>
     <w:uiPriority w:val="72"/>
     <w:pPr>
       <w:spacing w:after="0" w:line="240" w:lineRule="auto"/>
@@ -28995,7 +29519,6 @@
   <w:style w:type="table" w:styleId="122">
     <w:name w:val="Colorful List Accent 4"/>
     <w:basedOn w:val="32"/>
-    <w:qFormat/>
     <w:uiPriority w:val="72"/>
     <w:pPr>
       <w:spacing w:after="0" w:line="240" w:lineRule="auto"/>
@@ -29180,7 +29703,6 @@
   <w:style w:type="table" w:styleId="124">
     <w:name w:val="Colorful List Accent 6"/>
     <w:basedOn w:val="32"/>
-    <w:qFormat/>
     <w:uiPriority w:val="72"/>
     <w:pPr>
       <w:spacing w:after="0" w:line="240" w:lineRule="auto"/>
@@ -29273,7 +29795,6 @@
   <w:style w:type="table" w:styleId="125">
     <w:name w:val="Colorful Grid"/>
     <w:basedOn w:val="32"/>
-    <w:qFormat/>
     <w:uiPriority w:val="73"/>
     <w:pPr>
       <w:spacing w:after="0" w:line="240" w:lineRule="auto"/>
@@ -29370,7 +29891,6 @@
   <w:style w:type="table" w:styleId="126">
     <w:name w:val="Colorful Grid Accent 1"/>
     <w:basedOn w:val="32"/>
-    <w:qFormat/>
     <w:uiPriority w:val="73"/>
     <w:pPr>
       <w:spacing w:after="0" w:line="240" w:lineRule="auto"/>
@@ -29467,7 +29987,6 @@
   <w:style w:type="table" w:styleId="127">
     <w:name w:val="Colorful Grid Accent 2"/>
     <w:basedOn w:val="32"/>
-    <w:qFormat/>
     <w:uiPriority w:val="73"/>
     <w:pPr>
       <w:spacing w:after="0" w:line="240" w:lineRule="auto"/>
@@ -29660,7 +30179,6 @@
   <w:style w:type="table" w:styleId="129">
     <w:name w:val="Colorful Grid Accent 4"/>
     <w:basedOn w:val="32"/>
-    <w:qFormat/>
     <w:uiPriority w:val="73"/>
     <w:pPr>
       <w:spacing w:after="0" w:line="240" w:lineRule="auto"/>
@@ -29757,7 +30275,6 @@
   <w:style w:type="table" w:styleId="130">
     <w:name w:val="Colorful Grid Accent 5"/>
     <w:basedOn w:val="32"/>
-    <w:qFormat/>
     <w:uiPriority w:val="73"/>
     <w:pPr>
       <w:spacing w:after="0" w:line="240" w:lineRule="auto"/>
@@ -29854,7 +30371,6 @@
   <w:style w:type="table" w:styleId="131">
     <w:name w:val="Colorful Grid Accent 6"/>
     <w:basedOn w:val="32"/>
-    <w:qFormat/>
     <w:uiPriority w:val="73"/>
     <w:pPr>
       <w:spacing w:after="0" w:line="240" w:lineRule="auto"/>
@@ -29998,7 +30514,6 @@
     <w:name w:val="Heading 1 Char"/>
     <w:basedOn w:val="132"/>
     <w:link w:val="3"/>
-    <w:qFormat/>
     <w:uiPriority w:val="9"/>
     <w:rPr>
       <w:rFonts w:asciiTheme="majorHAnsi" w:hAnsiTheme="majorHAnsi" w:eastAsiaTheme="majorEastAsia" w:cstheme="majorBidi"/>
@@ -30013,7 +30528,6 @@
     <w:name w:val="Heading 2 Char"/>
     <w:basedOn w:val="132"/>
     <w:link w:val="4"/>
-    <w:qFormat/>
     <w:uiPriority w:val="9"/>
     <w:rPr>
       <w:rFonts w:asciiTheme="majorHAnsi" w:hAnsiTheme="majorHAnsi" w:eastAsiaTheme="majorEastAsia" w:cstheme="majorBidi"/>
@@ -30033,7 +30547,6 @@
     <w:name w:val="Heading 3 Char"/>
     <w:basedOn w:val="132"/>
     <w:link w:val="5"/>
-    <w:qFormat/>
     <w:uiPriority w:val="9"/>
     <w:rPr>
       <w:rFonts w:asciiTheme="majorHAnsi" w:hAnsiTheme="majorHAnsi" w:eastAsiaTheme="majorEastAsia" w:cstheme="majorBidi"/>
@@ -30065,7 +30578,6 @@
     <w:name w:val="Subtitle Char"/>
     <w:basedOn w:val="132"/>
     <w:link w:val="26"/>
-    <w:qFormat/>
     <w:uiPriority w:val="11"/>
     <w:rPr>
       <w:rFonts w:asciiTheme="majorHAnsi" w:hAnsiTheme="majorHAnsi" w:eastAsiaTheme="majorEastAsia" w:cstheme="majorBidi"/>
@@ -30096,21 +30608,18 @@
     <w:name w:val="Body Text Char"/>
     <w:basedOn w:val="132"/>
     <w:link w:val="19"/>
-    <w:qFormat/>
     <w:uiPriority w:val="99"/>
   </w:style>
   <w:style w:type="character" w:customStyle="1" w:styleId="145">
     <w:name w:val="Body Text 2 Char"/>
     <w:basedOn w:val="132"/>
     <w:link w:val="28"/>
-    <w:qFormat/>
     <w:uiPriority w:val="99"/>
   </w:style>
   <w:style w:type="character" w:customStyle="1" w:styleId="146">
     <w:name w:val="Body Text 3 Char"/>
     <w:basedOn w:val="132"/>
     <w:link w:val="17"/>
-    <w:qFormat/>
     <w:uiPriority w:val="99"/>
     <w:rPr>
       <w:sz w:val="16"/>
@@ -30121,7 +30630,6 @@
     <w:name w:val="Macro Text Char"/>
     <w:basedOn w:val="132"/>
     <w:link w:val="2"/>
-    <w:qFormat/>
     <w:uiPriority w:val="99"/>
     <w:rPr>
       <w:rFonts w:ascii="Courier" w:hAnsi="Courier"/>
@@ -30151,7 +30659,6 @@
     <w:name w:val="Quote Char"/>
     <w:basedOn w:val="132"/>
     <w:link w:val="148"/>
-    <w:qFormat/>
     <w:uiPriority w:val="29"/>
     <w:rPr>
       <w:i/>
@@ -30169,7 +30676,6 @@
     <w:basedOn w:val="132"/>
     <w:link w:val="6"/>
     <w:semiHidden/>
-    <w:qFormat/>
     <w:uiPriority w:val="9"/>
     <w:rPr>
       <w:rFonts w:asciiTheme="majorHAnsi" w:hAnsiTheme="majorHAnsi" w:eastAsiaTheme="majorEastAsia" w:cstheme="majorBidi"/>
@@ -30201,7 +30707,6 @@
     <w:basedOn w:val="132"/>
     <w:link w:val="8"/>
     <w:semiHidden/>
-    <w:qFormat/>
     <w:uiPriority w:val="9"/>
     <w:rPr>
       <w:rFonts w:asciiTheme="majorHAnsi" w:hAnsiTheme="majorHAnsi" w:eastAsiaTheme="majorEastAsia" w:cstheme="majorBidi"/>
@@ -30215,7 +30720,6 @@
     <w:basedOn w:val="132"/>
     <w:link w:val="9"/>
     <w:semiHidden/>
-    <w:qFormat/>
     <w:uiPriority w:val="9"/>
     <w:rPr>
       <w:rFonts w:asciiTheme="majorHAnsi" w:hAnsiTheme="majorHAnsi" w:eastAsiaTheme="majorEastAsia" w:cstheme="majorBidi"/>
@@ -30237,7 +30741,6 @@
     <w:basedOn w:val="132"/>
     <w:link w:val="10"/>
     <w:semiHidden/>
-    <w:qFormat/>
     <w:uiPriority w:val="9"/>
     <w:rPr>
       <w:rFonts w:asciiTheme="majorHAnsi" w:hAnsiTheme="majorHAnsi" w:eastAsiaTheme="majorEastAsia" w:cstheme="majorBidi"/>
@@ -30256,7 +30759,6 @@
     <w:basedOn w:val="132"/>
     <w:link w:val="11"/>
     <w:semiHidden/>
-    <w:qFormat/>
     <w:uiPriority w:val="9"/>
     <w:rPr>
       <w:rFonts w:asciiTheme="majorHAnsi" w:hAnsiTheme="majorHAnsi" w:eastAsiaTheme="majorEastAsia" w:cstheme="majorBidi"/>
@@ -30306,7 +30808,6 @@
     <w:name w:val="Intense Quote Char"/>
     <w:basedOn w:val="132"/>
     <w:link w:val="156"/>
-    <w:qFormat/>
     <w:uiPriority w:val="30"/>
     <w:rPr>
       <w:b/>

</xml_diff>